<commit_message>
docs: Manual de Pagos v1.1 — fórmulas y criterios con ejemplo numérico y 'cómo cuadrar a mano' para saldo precio (SLA, fijos AutoFin, TEF, cuenta de paso), comisión dealer (tabla por local, carta manda hacia abajo, IVA/retención, corte) y comisión parque (universo, foto, arriendo); documentación v4.3 (v257.6)
Co-Authored-By: Claude Fable 5.1 <noreply@anthropic.com>
</commit_message>
<xml_diff>
--- a/api-gateway/public/mantenedores/documentacion/descargas/Manual-Pagos-Saldos-Comisiones-Business-Suite.docx
+++ b/api-gateway/public/mantenedores/documentacion/descargas/Manual-Pagos-Saldos-Comisiones-Business-Suite.docx
@@ -236,7 +236,7 @@
           <w:i w:val="0"/>
           <w:sz w:val="22"/>
         </w:rPr>
-        <w:t>Versión 1.0 · 18 de septiembre de 2026 · Suite v257.4</w:t>
+        <w:t>Versión 1.1 · 18 de septiembre de 2026 · Suite v257.6</w:t>
       </w:r>
     </w:p>
     <w:p>
@@ -404,6 +404,64 @@
                 <w:sz w:val="18"/>
               </w:rPr>
               <w:t>Primera versión. Cubre los tres circuitos de pago a contrapartes comerciales tal como operan en la suite v257.4 (corte de cartola, comisión a pagar al cierre de mes, pago espejo de parques, TEF Banco Internacional, segregación de funciones, arriendos por Pagos Recurrentes).</w:t>
+            </w:r>
+          </w:p>
+        </w:tc>
+      </w:tr>
+      <w:tr>
+        <w:tc>
+          <w:tcPr>
+            <w:tcW w:type="dxa" w:w="907"/>
+          </w:tcPr>
+          <w:p>
+            <w:r/>
+            <w:r>
+              <w:rPr>
+                <w:sz w:val="18"/>
+              </w:rPr>
+              <w:t>1.1</w:t>
+            </w:r>
+          </w:p>
+        </w:tc>
+        <w:tc>
+          <w:tcPr>
+            <w:tcW w:type="dxa" w:w="1247"/>
+          </w:tcPr>
+          <w:p>
+            <w:r/>
+            <w:r>
+              <w:rPr>
+                <w:sz w:val="18"/>
+              </w:rPr>
+              <w:t>18-09-2026</w:t>
+            </w:r>
+          </w:p>
+        </w:tc>
+        <w:tc>
+          <w:tcPr>
+            <w:tcW w:type="dxa" w:w="2041"/>
+          </w:tcPr>
+          <w:p>
+            <w:r/>
+            <w:r>
+              <w:rPr>
+                <w:sz w:val="18"/>
+              </w:rPr>
+              <w:t>Patricio Escobar / Claude</w:t>
+            </w:r>
+          </w:p>
+        </w:tc>
+        <w:tc>
+          <w:tcPr>
+            <w:tcW w:type="dxa" w:w="5159"/>
+          </w:tcPr>
+          <w:p>
+            <w:r/>
+            <w:r>
+              <w:rPr>
+                <w:sz w:val="18"/>
+              </w:rPr>
+              <w:t>Secciones de fórmulas y criterios con ejemplo numérico y caja "Cómo cuadrar a mano" para saldos (8.1), comisión dealer (14.1) y comisión parque (19.1).</w:t>
             </w:r>
           </w:p>
         </w:tc>
@@ -4480,6 +4538,1056 @@
         <w:spacing w:after="40"/>
       </w:pPr>
     </w:p>
+    <w:p>
+      <w:pPr>
+        <w:pStyle w:val="Heading2"/>
+      </w:pPr>
+      <w:r>
+        <w:t>8.1 Fórmulas y criterios de cálculo del saldo precio</w:t>
+      </w:r>
+    </w:p>
+    <w:p>
+      <w:pPr>
+        <w:spacing w:after="80"/>
+      </w:pPr>
+      <w:r>
+        <w:rPr>
+          <w:b w:val="0"/>
+          <w:i w:val="0"/>
+        </w:rPr>
+        <w:t>Motores únicos: montoSaldoOrden (postventa.controller), shared/sla-saldo.js (vencimiento), shared/tef-internacional.js (archivo del banco). Parámetros en Parámetros de Crédito, Categoría y Potencial Dealer y Post Venta → Mantenedores.</w:t>
+      </w:r>
+    </w:p>
+    <w:tbl>
+      <w:tblPr>
+        <w:tblStyle w:val="TableGrid"/>
+        <w:tblW w:type="auto" w:w="0"/>
+        <w:jc w:val="center"/>
+        <w:tblLook w:firstColumn="1" w:firstRow="1" w:lastColumn="0" w:lastRow="0" w:noHBand="0" w:noVBand="1" w:val="04A0"/>
+      </w:tblPr>
+      <w:tblGrid>
+        <w:gridCol w:w="3249"/>
+        <w:gridCol w:w="3249"/>
+        <w:gridCol w:w="3249"/>
+      </w:tblGrid>
+      <w:tr>
+        <w:tc>
+          <w:tcPr>
+            <w:tcW w:type="dxa" w:w="1928"/>
+            <w:shd w:val="clear" w:color="auto" w:fill="1F4E79"/>
+          </w:tcPr>
+          <w:p>
+            <w:r/>
+            <w:r>
+              <w:rPr>
+                <w:b/>
+                <w:color w:val="FFFFFF"/>
+                <w:sz w:val="18"/>
+              </w:rPr>
+              <w:t>Concepto</w:t>
+            </w:r>
+          </w:p>
+        </w:tc>
+        <w:tc>
+          <w:tcPr>
+            <w:tcW w:type="dxa" w:w="5443"/>
+            <w:shd w:val="clear" w:color="auto" w:fill="1F4E79"/>
+          </w:tcPr>
+          <w:p>
+            <w:r/>
+            <w:r>
+              <w:rPr>
+                <w:b/>
+                <w:color w:val="FFFFFF"/>
+                <w:sz w:val="18"/>
+              </w:rPr>
+              <w:t>Regla / fórmula</w:t>
+            </w:r>
+          </w:p>
+        </w:tc>
+        <w:tc>
+          <w:tcPr>
+            <w:tcW w:type="dxa" w:w="1984"/>
+            <w:shd w:val="clear" w:color="auto" w:fill="1F4E79"/>
+          </w:tcPr>
+          <w:p>
+            <w:r/>
+            <w:r>
+              <w:rPr>
+                <w:b/>
+                <w:color w:val="FFFFFF"/>
+                <w:sz w:val="18"/>
+              </w:rPr>
+              <w:t>Parámetro / fuente</w:t>
+            </w:r>
+          </w:p>
+        </w:tc>
+      </w:tr>
+      <w:tr>
+        <w:tc>
+          <w:tcPr>
+            <w:tcW w:type="dxa" w:w="1928"/>
+          </w:tcPr>
+          <w:p>
+            <w:r/>
+            <w:r>
+              <w:rPr>
+                <w:sz w:val="18"/>
+              </w:rPr>
+              <w:t>Saldo precio</w:t>
+            </w:r>
+          </w:p>
+        </w:tc>
+        <w:tc>
+          <w:tcPr>
+            <w:tcW w:type="dxa" w:w="5443"/>
+          </w:tcPr>
+          <w:p>
+            <w:r/>
+            <w:r>
+              <w:rPr>
+                <w:sz w:val="18"/>
+              </w:rPr>
+              <w:t>precio del vehículo − pie − lo que retiene la financiera = lo que la financiera gira para el dealer. Viene de la carga (Trinidad) y se mantiene con la última información; el crédito es la fuente (creditos.saldo_precio).</w:t>
+            </w:r>
+          </w:p>
+        </w:tc>
+        <w:tc>
+          <w:tcPr>
+            <w:tcW w:type="dxa" w:w="1984"/>
+          </w:tcPr>
+          <w:p>
+            <w:r/>
+            <w:r>
+              <w:rPr>
+                <w:sz w:val="18"/>
+              </w:rPr>
+              <w:t>carga masiva · cuadratura Trinidad</w:t>
+            </w:r>
+          </w:p>
+        </w:tc>
+      </w:tr>
+      <w:tr>
+        <w:tc>
+          <w:tcPr>
+            <w:tcW w:type="dxa" w:w="1928"/>
+          </w:tcPr>
+          <w:p>
+            <w:r/>
+            <w:r>
+              <w:rPr>
+                <w:sz w:val="18"/>
+              </w:rPr>
+              <w:t>Monto de la ODP (AutoFin)</w:t>
+            </w:r>
+          </w:p>
+        </w:tc>
+        <w:tc>
+          <w:tcPr>
+            <w:tcW w:type="dxa" w:w="5443"/>
+          </w:tcPr>
+          <w:p>
+            <w:r/>
+            <w:r>
+              <w:rPr>
+                <w:sz w:val="18"/>
+              </w:rPr>
+              <w:t>saldo precio + transferencia (inscripción) + limitación de dominio. Se congela en postventa_ordenes.monto y op_correlativos.monto al emitir.</w:t>
+            </w:r>
+          </w:p>
+        </w:tc>
+        <w:tc>
+          <w:tcPr>
+            <w:tcW w:type="dxa" w:w="1984"/>
+          </w:tcPr>
+          <w:p>
+            <w:r/>
+            <w:r>
+              <w:rPr>
+                <w:sz w:val="18"/>
+              </w:rPr>
+              <w:t>parametros_credito.autofin_inscripcion ($39.240) · autofin_limitacion ($6.140)</w:t>
+            </w:r>
+          </w:p>
+        </w:tc>
+      </w:tr>
+      <w:tr>
+        <w:tc>
+          <w:tcPr>
+            <w:tcW w:type="dxa" w:w="1928"/>
+          </w:tcPr>
+          <w:p>
+            <w:r/>
+            <w:r>
+              <w:rPr>
+                <w:sz w:val="18"/>
+              </w:rPr>
+              <w:t>Monto de la ODP (otras financieras)</w:t>
+            </w:r>
+          </w:p>
+        </w:tc>
+        <w:tc>
+          <w:tcPr>
+            <w:tcW w:type="dxa" w:w="5443"/>
+          </w:tcPr>
+          <w:p>
+            <w:r/>
+            <w:r>
+              <w:rPr>
+                <w:sz w:val="18"/>
+              </w:rPr>
+              <w:t>saldo precio puro.</w:t>
+            </w:r>
+          </w:p>
+        </w:tc>
+        <w:tc>
+          <w:tcPr>
+            <w:tcW w:type="dxa" w:w="1984"/>
+          </w:tcPr>
+          <w:p>
+            <w:r/>
+            <w:r>
+              <w:rPr>
+                <w:sz w:val="18"/>
+              </w:rPr>
+            </w:r>
+          </w:p>
+        </w:tc>
+      </w:tr>
+      <w:tr>
+        <w:tc>
+          <w:tcPr>
+            <w:tcW w:type="dxa" w:w="1928"/>
+          </w:tcPr>
+          <w:p>
+            <w:r/>
+            <w:r>
+              <w:rPr>
+                <w:sz w:val="18"/>
+              </w:rPr>
+              <w:t>SLA de pago</w:t>
+            </w:r>
+          </w:p>
+        </w:tc>
+        <w:tc>
+          <w:tcPr>
+            <w:tcW w:type="dxa" w:w="5443"/>
+          </w:tcPr>
+          <w:p>
+            <w:r/>
+            <w:r>
+              <w:rPr>
+                <w:sz w:val="18"/>
+              </w:rPr>
+              <w:t>horas hábiles por categoría del dealer: SUPER PARTNER 24 · PARTNER 48 · SOCIO 72. Fundantes recibidos antes de la hora de corte (14:00) → el plazo corre desde ese día; después → desde el día hábil siguiente. Días hábiles lunes a viernes sin feriados. La hora es la de Chile reconstruida por el motor, no la del servidor.</w:t>
+            </w:r>
+          </w:p>
+        </w:tc>
+        <w:tc>
+          <w:tcPr>
+            <w:tcW w:type="dxa" w:w="1984"/>
+          </w:tcPr>
+          <w:p>
+            <w:r/>
+            <w:r>
+              <w:rPr>
+                <w:sz w:val="18"/>
+              </w:rPr>
+              <w:t>dealer_categorias.pago_horas_habiles · parametros_credito.sp_fundantes_corte_hora</w:t>
+            </w:r>
+          </w:p>
+        </w:tc>
+      </w:tr>
+      <w:tr>
+        <w:tc>
+          <w:tcPr>
+            <w:tcW w:type="dxa" w:w="1928"/>
+          </w:tcPr>
+          <w:p>
+            <w:r/>
+            <w:r>
+              <w:rPr>
+                <w:sz w:val="18"/>
+              </w:rPr>
+              <w:t>Vencido</w:t>
+            </w:r>
+          </w:p>
+        </w:tc>
+        <w:tc>
+          <w:tcPr>
+            <w:tcW w:type="dxa" w:w="5443"/>
+          </w:tcPr>
+          <w:p>
+            <w:r/>
+            <w:r>
+              <w:rPr>
+                <w:sz w:val="18"/>
+              </w:rPr>
+              <w:t>hoy &gt; vencimiento y sin SALDO PRECIO PAGADO → fila en rojo en la planilla de Tesorería.</w:t>
+            </w:r>
+          </w:p>
+        </w:tc>
+        <w:tc>
+          <w:tcPr>
+            <w:tcW w:type="dxa" w:w="1984"/>
+          </w:tcPr>
+          <w:p>
+            <w:r/>
+            <w:r>
+              <w:rPr>
+                <w:sz w:val="18"/>
+              </w:rPr>
+              <w:t>saldo-proceso-pago</w:t>
+            </w:r>
+          </w:p>
+        </w:tc>
+      </w:tr>
+      <w:tr>
+        <w:tc>
+          <w:tcPr>
+            <w:tcW w:type="dxa" w:w="1928"/>
+          </w:tcPr>
+          <w:p>
+            <w:r/>
+            <w:r>
+              <w:rPr>
+                <w:sz w:val="18"/>
+              </w:rPr>
+              <w:t>Fondos del día</w:t>
+            </w:r>
+          </w:p>
+        </w:tc>
+        <w:tc>
+          <w:tcPr>
+            <w:tcW w:type="dxa" w:w="5443"/>
+          </w:tcPr>
+          <w:p>
+            <w:r/>
+            <w:r>
+              <w:rPr>
+                <w:sz w:val="18"/>
+              </w:rPr>
+              <w:t>techo de la selección; las propuestas llenan hasta ese monto en orden de vencimiento.</w:t>
+            </w:r>
+          </w:p>
+        </w:tc>
+        <w:tc>
+          <w:tcPr>
+            <w:tcW w:type="dxa" w:w="1984"/>
+          </w:tcPr>
+          <w:p>
+            <w:r/>
+            <w:r>
+              <w:rPr>
+                <w:sz w:val="18"/>
+              </w:rPr>
+              <w:t>postventa_config.fondos_disp</w:t>
+            </w:r>
+          </w:p>
+        </w:tc>
+      </w:tr>
+      <w:tr>
+        <w:tc>
+          <w:tcPr>
+            <w:tcW w:type="dxa" w:w="1928"/>
+          </w:tcPr>
+          <w:p>
+            <w:r/>
+            <w:r>
+              <w:rPr>
+                <w:sz w:val="18"/>
+              </w:rPr>
+              <w:t>TEF: filas</w:t>
+            </w:r>
+          </w:p>
+        </w:tc>
+        <w:tc>
+          <w:tcPr>
+            <w:tcW w:type="dxa" w:w="5443"/>
+          </w:tcPr>
+          <w:p>
+            <w:r/>
+            <w:r>
+              <w:rPr>
+                <w:sz w:val="18"/>
+              </w:rPr>
+              <w:t>una por ODP con banco reconocido (código SBIF del catálogo con alias) y cuenta; sin eso queda fuera y se lista.</w:t>
+            </w:r>
+          </w:p>
+        </w:tc>
+        <w:tc>
+          <w:tcPr>
+            <w:tcW w:type="dxa" w:w="1984"/>
+          </w:tcPr>
+          <w:p>
+            <w:r/>
+            <w:r>
+              <w:rPr>
+                <w:sz w:val="18"/>
+              </w:rPr>
+              <w:t>rh_catalogo BANCO · ficha del dealer</w:t>
+            </w:r>
+          </w:p>
+        </w:tc>
+      </w:tr>
+      <w:tr>
+        <w:tc>
+          <w:tcPr>
+            <w:tcW w:type="dxa" w:w="1928"/>
+          </w:tcPr>
+          <w:p>
+            <w:r/>
+            <w:r>
+              <w:rPr>
+                <w:sz w:val="18"/>
+              </w:rPr>
+              <w:t>TEF: tope y división</w:t>
+            </w:r>
+          </w:p>
+        </w:tc>
+        <w:tc>
+          <w:tcPr>
+            <w:tcW w:type="dxa" w:w="5443"/>
+          </w:tcPr>
+          <w:p>
+            <w:r/>
+            <w:r>
+              <w:rPr>
+                <w:sz w:val="18"/>
+              </w:rPr>
+              <w:t>monto &gt; tef_monto_max → N = techo(monto ÷ tope) transferencias iguales a la misma cuenta, motivo "… k/N". Cada parte cuenta como cargo.</w:t>
+            </w:r>
+          </w:p>
+        </w:tc>
+        <w:tc>
+          <w:tcPr>
+            <w:tcW w:type="dxa" w:w="1984"/>
+          </w:tcPr>
+          <w:p>
+            <w:r/>
+            <w:r>
+              <w:rPr>
+                <w:sz w:val="18"/>
+              </w:rPr>
+              <w:t>tef_monto_max 7.000.000 · tef_dividir 1</w:t>
+            </w:r>
+          </w:p>
+        </w:tc>
+      </w:tr>
+      <w:tr>
+        <w:tc>
+          <w:tcPr>
+            <w:tcW w:type="dxa" w:w="1928"/>
+          </w:tcPr>
+          <w:p>
+            <w:r/>
+            <w:r>
+              <w:rPr>
+                <w:sz w:val="18"/>
+              </w:rPr>
+              <w:t>TEF: cupo</w:t>
+            </w:r>
+          </w:p>
+        </w:tc>
+        <w:tc>
+          <w:tcPr>
+            <w:tcW w:type="dxa" w:w="5443"/>
+          </w:tcPr>
+          <w:p>
+            <w:r/>
+            <w:r>
+              <w:rPr>
+                <w:sz w:val="18"/>
+              </w:rPr>
+              <w:t>te quedan (tef_gratis_mes − cargos del mes en las tres pantallas); sobre eso el banco cobra. Cada descarga registra un envío: no descargar dos veces el mismo lote.</w:t>
+            </w:r>
+          </w:p>
+        </w:tc>
+        <w:tc>
+          <w:tcPr>
+            <w:tcW w:type="dxa" w:w="1984"/>
+          </w:tcPr>
+          <w:p>
+            <w:r/>
+            <w:r>
+              <w:rPr>
+                <w:sz w:val="18"/>
+              </w:rPr>
+              <w:t>tef_gratis_mes 150 · tef_envios</w:t>
+            </w:r>
+          </w:p>
+        </w:tc>
+      </w:tr>
+      <w:tr>
+        <w:tc>
+          <w:tcPr>
+            <w:tcW w:type="dxa" w:w="1928"/>
+          </w:tcPr>
+          <w:p>
+            <w:r/>
+            <w:r>
+              <w:rPr>
+                <w:sz w:val="18"/>
+              </w:rPr>
+              <w:t>TEF: tipo de cuenta</w:t>
+            </w:r>
+          </w:p>
+        </w:tc>
+        <w:tc>
+          <w:tcPr>
+            <w:tcW w:type="dxa" w:w="5443"/>
+          </w:tcPr>
+          <w:p>
+            <w:r/>
+            <w:r>
+              <w:rPr>
+                <w:sz w:val="18"/>
+              </w:rPr>
+              <w:t>corriente (1) por defecto; vista (2) si el tipo lo dice o si el banco está en tef_bancos_vista (Mercado Pago, Tenpo).</w:t>
+            </w:r>
+          </w:p>
+        </w:tc>
+        <w:tc>
+          <w:tcPr>
+            <w:tcW w:type="dxa" w:w="1984"/>
+          </w:tcPr>
+          <w:p>
+            <w:r/>
+            <w:r>
+              <w:rPr>
+                <w:sz w:val="18"/>
+              </w:rPr>
+              <w:t>tef_bancos_vista</w:t>
+            </w:r>
+          </w:p>
+        </w:tc>
+      </w:tr>
+      <w:tr>
+        <w:tc>
+          <w:tcPr>
+            <w:tcW w:type="dxa" w:w="1928"/>
+          </w:tcPr>
+          <w:p>
+            <w:r/>
+            <w:r>
+              <w:rPr>
+                <w:sz w:val="18"/>
+              </w:rPr>
+              <w:t>Cuenta de paso</w:t>
+            </w:r>
+          </w:p>
+        </w:tc>
+        <w:tc>
+          <w:tcPr>
+            <w:tcW w:type="dxa" w:w="5443"/>
+          </w:tcPr>
+          <w:p>
+            <w:r/>
+            <w:r>
+              <w:rPr>
+                <w:sz w:val="18"/>
+              </w:rPr>
+              <w:t>saldo 2102045 = Σ ODP con FONDOS RECIBIDOS − Σ ODP con SALDO PRECIO PAGADO, siempre por el TOTAL de la ODP.</w:t>
+            </w:r>
+          </w:p>
+        </w:tc>
+        <w:tc>
+          <w:tcPr>
+            <w:tcW w:type="dxa" w:w="1984"/>
+          </w:tcPr>
+          <w:p>
+            <w:r/>
+            <w:r>
+              <w:rPr>
+                <w:sz w:val="18"/>
+              </w:rPr>
+              <w:t>Cierre de Mes</w:t>
+            </w:r>
+          </w:p>
+        </w:tc>
+      </w:tr>
+    </w:tbl>
+    <w:p>
+      <w:pPr>
+        <w:spacing w:after="40"/>
+      </w:pPr>
+    </w:p>
+    <w:p>
+      <w:pPr>
+        <w:spacing w:after="40"/>
+      </w:pPr>
+      <w:r>
+        <w:rPr>
+          <w:b/>
+          <w:i w:val="0"/>
+          <w:color w:val="1F4E79"/>
+        </w:rPr>
+        <w:t>Ejemplo numérico</w:t>
+      </w:r>
+    </w:p>
+    <w:tbl>
+      <w:tblPr>
+        <w:tblStyle w:val="TableGrid"/>
+        <w:tblW w:type="auto" w:w="0"/>
+        <w:jc w:val="center"/>
+        <w:tblLook w:firstColumn="1" w:firstRow="1" w:lastColumn="0" w:lastRow="0" w:noHBand="0" w:noVBand="1" w:val="04A0"/>
+      </w:tblPr>
+      <w:tblGrid>
+        <w:gridCol w:w="3249"/>
+        <w:gridCol w:w="3249"/>
+        <w:gridCol w:w="3249"/>
+      </w:tblGrid>
+      <w:tr>
+        <w:tc>
+          <w:tcPr>
+            <w:tcW w:type="dxa" w:w="2608"/>
+            <w:shd w:val="clear" w:color="auto" w:fill="1F4E79"/>
+          </w:tcPr>
+          <w:p>
+            <w:r/>
+            <w:r>
+              <w:rPr>
+                <w:b/>
+                <w:color w:val="FFFFFF"/>
+                <w:sz w:val="18"/>
+              </w:rPr>
+              <w:t>Caso</w:t>
+            </w:r>
+          </w:p>
+        </w:tc>
+        <w:tc>
+          <w:tcPr>
+            <w:tcW w:type="dxa" w:w="4762"/>
+            <w:shd w:val="clear" w:color="auto" w:fill="1F4E79"/>
+          </w:tcPr>
+          <w:p>
+            <w:r/>
+            <w:r>
+              <w:rPr>
+                <w:b/>
+                <w:color w:val="FFFFFF"/>
+                <w:sz w:val="18"/>
+              </w:rPr>
+              <w:t>Cálculo</w:t>
+            </w:r>
+          </w:p>
+        </w:tc>
+        <w:tc>
+          <w:tcPr>
+            <w:tcW w:type="dxa" w:w="1984"/>
+            <w:shd w:val="clear" w:color="auto" w:fill="1F4E79"/>
+          </w:tcPr>
+          <w:p>
+            <w:r/>
+            <w:r>
+              <w:rPr>
+                <w:b/>
+                <w:color w:val="FFFFFF"/>
+                <w:sz w:val="18"/>
+              </w:rPr>
+              <w:t>Resultado</w:t>
+            </w:r>
+          </w:p>
+        </w:tc>
+      </w:tr>
+      <w:tr>
+        <w:tc>
+          <w:tcPr>
+            <w:tcW w:type="dxa" w:w="2608"/>
+          </w:tcPr>
+          <w:p>
+            <w:r/>
+            <w:r>
+              <w:rPr>
+                <w:sz w:val="18"/>
+              </w:rPr>
+              <w:t>ODP AutoFin, saldo $11.640.000</w:t>
+            </w:r>
+          </w:p>
+        </w:tc>
+        <w:tc>
+          <w:tcPr>
+            <w:tcW w:type="dxa" w:w="4762"/>
+          </w:tcPr>
+          <w:p>
+            <w:r/>
+            <w:r>
+              <w:rPr>
+                <w:sz w:val="18"/>
+              </w:rPr>
+              <w:t>11.640.000 + 39.240 + 6.140</w:t>
+            </w:r>
+          </w:p>
+        </w:tc>
+        <w:tc>
+          <w:tcPr>
+            <w:tcW w:type="dxa" w:w="1984"/>
+          </w:tcPr>
+          <w:p>
+            <w:r/>
+            <w:r>
+              <w:rPr>
+                <w:sz w:val="18"/>
+              </w:rPr>
+              <w:t>$11.685.380</w:t>
+            </w:r>
+          </w:p>
+        </w:tc>
+      </w:tr>
+      <w:tr>
+        <w:tc>
+          <w:tcPr>
+            <w:tcW w:type="dxa" w:w="2608"/>
+          </w:tcPr>
+          <w:p>
+            <w:r/>
+            <w:r>
+              <w:rPr>
+                <w:sz w:val="18"/>
+              </w:rPr>
+              <w:t>ODP Unidad, saldo $8.200.000</w:t>
+            </w:r>
+          </w:p>
+        </w:tc>
+        <w:tc>
+          <w:tcPr>
+            <w:tcW w:type="dxa" w:w="4762"/>
+          </w:tcPr>
+          <w:p>
+            <w:r/>
+            <w:r>
+              <w:rPr>
+                <w:sz w:val="18"/>
+              </w:rPr>
+              <w:t>sin fijos</w:t>
+            </w:r>
+          </w:p>
+        </w:tc>
+        <w:tc>
+          <w:tcPr>
+            <w:tcW w:type="dxa" w:w="1984"/>
+          </w:tcPr>
+          <w:p>
+            <w:r/>
+            <w:r>
+              <w:rPr>
+                <w:sz w:val="18"/>
+              </w:rPr>
+              <w:t>$8.200.000</w:t>
+            </w:r>
+          </w:p>
+        </w:tc>
+      </w:tr>
+      <w:tr>
+        <w:tc>
+          <w:tcPr>
+            <w:tcW w:type="dxa" w:w="2608"/>
+          </w:tcPr>
+          <w:p>
+            <w:r/>
+            <w:r>
+              <w:rPr>
+                <w:sz w:val="18"/>
+              </w:rPr>
+              <w:t>SLA: fundantes recibidos jueves 17-09 a las 11:30, dealer PARTNER</w:t>
+            </w:r>
+          </w:p>
+        </w:tc>
+        <w:tc>
+          <w:tcPr>
+            <w:tcW w:type="dxa" w:w="4762"/>
+          </w:tcPr>
+          <w:p>
+            <w:r/>
+            <w:r>
+              <w:rPr>
+                <w:sz w:val="18"/>
+              </w:rPr>
+              <w:t>antes del corte de 14:00 → 48 h hábiles desde el 17 → vence lunes 21-09 (viernes 18 y lunes 21 son los dos días hábiles; sábado y domingo no cuentan)</w:t>
+            </w:r>
+          </w:p>
+        </w:tc>
+        <w:tc>
+          <w:tcPr>
+            <w:tcW w:type="dxa" w:w="1984"/>
+          </w:tcPr>
+          <w:p>
+            <w:r/>
+            <w:r>
+              <w:rPr>
+                <w:sz w:val="18"/>
+              </w:rPr>
+              <w:t>21-09-2026</w:t>
+            </w:r>
+          </w:p>
+        </w:tc>
+      </w:tr>
+      <w:tr>
+        <w:tc>
+          <w:tcPr>
+            <w:tcW w:type="dxa" w:w="2608"/>
+          </w:tcPr>
+          <w:p>
+            <w:r/>
+            <w:r>
+              <w:rPr>
+                <w:sz w:val="18"/>
+              </w:rPr>
+              <w:t>SLA: mismos fundantes recibidos a las 15:20</w:t>
+            </w:r>
+          </w:p>
+        </w:tc>
+        <w:tc>
+          <w:tcPr>
+            <w:tcW w:type="dxa" w:w="4762"/>
+          </w:tcPr>
+          <w:p>
+            <w:r/>
+            <w:r>
+              <w:rPr>
+                <w:sz w:val="18"/>
+              </w:rPr>
+              <w:t>después del corte → desde el día hábil siguiente (viernes 18) → vence martes 22-09</w:t>
+            </w:r>
+          </w:p>
+        </w:tc>
+        <w:tc>
+          <w:tcPr>
+            <w:tcW w:type="dxa" w:w="1984"/>
+          </w:tcPr>
+          <w:p>
+            <w:r/>
+            <w:r>
+              <w:rPr>
+                <w:sz w:val="18"/>
+              </w:rPr>
+              <w:t>22-09-2026</w:t>
+            </w:r>
+          </w:p>
+        </w:tc>
+      </w:tr>
+      <w:tr>
+        <w:tc>
+          <w:tcPr>
+            <w:tcW w:type="dxa" w:w="2608"/>
+          </w:tcPr>
+          <w:p>
+            <w:r/>
+            <w:r>
+              <w:rPr>
+                <w:sz w:val="18"/>
+              </w:rPr>
+              <w:t>SLA: viernes 18-09 a las 15:20, dealer SUPER PARTNER (24 h)</w:t>
+            </w:r>
+          </w:p>
+        </w:tc>
+        <w:tc>
+          <w:tcPr>
+            <w:tcW w:type="dxa" w:w="4762"/>
+          </w:tcPr>
+          <w:p>
+            <w:r/>
+            <w:r>
+              <w:rPr>
+                <w:sz w:val="18"/>
+              </w:rPr>
+              <w:t>desde el lunes 21 → vence martes 22-09</w:t>
+            </w:r>
+          </w:p>
+        </w:tc>
+        <w:tc>
+          <w:tcPr>
+            <w:tcW w:type="dxa" w:w="1984"/>
+          </w:tcPr>
+          <w:p>
+            <w:r/>
+            <w:r>
+              <w:rPr>
+                <w:sz w:val="18"/>
+              </w:rPr>
+              <w:t>22-09-2026</w:t>
+            </w:r>
+          </w:p>
+        </w:tc>
+      </w:tr>
+      <w:tr>
+        <w:tc>
+          <w:tcPr>
+            <w:tcW w:type="dxa" w:w="2608"/>
+          </w:tcPr>
+          <w:p>
+            <w:r/>
+            <w:r>
+              <w:rPr>
+                <w:sz w:val="18"/>
+              </w:rPr>
+              <w:t>TEF con 3 ODP: 11.685.380 · 8.200.000 · 4.500.000</w:t>
+            </w:r>
+          </w:p>
+        </w:tc>
+        <w:tc>
+          <w:tcPr>
+            <w:tcW w:type="dxa" w:w="4762"/>
+          </w:tcPr>
+          <w:p>
+            <w:r/>
+            <w:r>
+              <w:rPr>
+                <w:sz w:val="18"/>
+              </w:rPr>
+              <w:t>la primera supera 7.000.000 → 2 partes de 5.842.690; la segunda → 2 partes de 4.100.000; la tercera 1 → 5 cargos</w:t>
+            </w:r>
+          </w:p>
+        </w:tc>
+        <w:tc>
+          <w:tcPr>
+            <w:tcW w:type="dxa" w:w="1984"/>
+          </w:tcPr>
+          <w:p>
+            <w:r/>
+            <w:r>
+              <w:rPr>
+                <w:sz w:val="18"/>
+              </w:rPr>
+              <w:t>cupo usado 5 de 150</w:t>
+            </w:r>
+          </w:p>
+        </w:tc>
+      </w:tr>
+      <w:tr>
+        <w:tc>
+          <w:tcPr>
+            <w:tcW w:type="dxa" w:w="2608"/>
+          </w:tcPr>
+          <w:p>
+            <w:r/>
+            <w:r>
+              <w:rPr>
+                <w:sz w:val="18"/>
+              </w:rPr>
+              <w:t>Fondos del día $20.000.000</w:t>
+            </w:r>
+          </w:p>
+        </w:tc>
+        <w:tc>
+          <w:tcPr>
+            <w:tcW w:type="dxa" w:w="4762"/>
+          </w:tcPr>
+          <w:p>
+            <w:r/>
+            <w:r>
+              <w:rPr>
+                <w:sz w:val="18"/>
+              </w:rPr>
+              <w:t>propuesta: 11.685.380 + 8.200.000 = 19.885.380 (cabe); la de 4.500.000 queda para mañana</w:t>
+            </w:r>
+          </w:p>
+        </w:tc>
+        <w:tc>
+          <w:tcPr>
+            <w:tcW w:type="dxa" w:w="1984"/>
+          </w:tcPr>
+          <w:p>
+            <w:r/>
+            <w:r>
+              <w:rPr>
+                <w:sz w:val="18"/>
+              </w:rPr>
+              <w:t>2 ODP en la nómina</w:t>
+            </w:r>
+          </w:p>
+        </w:tc>
+      </w:tr>
+      <w:tr>
+        <w:tc>
+          <w:tcPr>
+            <w:tcW w:type="dxa" w:w="2608"/>
+          </w:tcPr>
+          <w:p>
+            <w:r/>
+            <w:r>
+              <w:rPr>
+                <w:sz w:val="18"/>
+              </w:rPr>
+              <w:t>Cuenta de paso al 30-09</w:t>
+            </w:r>
+          </w:p>
+        </w:tc>
+        <w:tc>
+          <w:tcPr>
+            <w:tcW w:type="dxa" w:w="4762"/>
+          </w:tcPr>
+          <w:p>
+            <w:r/>
+            <w:r>
+              <w:rPr>
+                <w:sz w:val="18"/>
+              </w:rPr>
+              <w:t>recibidos en el mes 45.000.000; pagados 41.000.000</w:t>
+            </w:r>
+          </w:p>
+        </w:tc>
+        <w:tc>
+          <w:tcPr>
+            <w:tcW w:type="dxa" w:w="1984"/>
+          </w:tcPr>
+          <w:p>
+            <w:r/>
+            <w:r>
+              <w:rPr>
+                <w:sz w:val="18"/>
+              </w:rPr>
+              <w:t>saldo 2102045 = $4.000.000 = ODP recibidas y aún no pagadas</w:t>
+            </w:r>
+          </w:p>
+        </w:tc>
+      </w:tr>
+    </w:tbl>
+    <w:p>
+      <w:pPr>
+        <w:spacing w:after="40"/>
+      </w:pPr>
+    </w:p>
+    <w:tbl>
+      <w:tblPr>
+        <w:tblStyle w:val="TableGrid"/>
+        <w:tblW w:type="auto" w:w="0"/>
+        <w:tblLook w:firstColumn="1" w:firstRow="1" w:lastColumn="0" w:lastRow="0" w:noHBand="0" w:noVBand="1" w:val="04A0"/>
+      </w:tblPr>
+      <w:tblGrid>
+        <w:gridCol w:w="9746"/>
+      </w:tblGrid>
+      <w:tr>
+        <w:tc>
+          <w:tcPr>
+            <w:tcW w:type="dxa" w:w="9746"/>
+            <w:shd w:val="clear" w:color="auto" w:fill="E8F0F8"/>
+          </w:tcPr>
+          <w:p>
+            <w:r/>
+            <w:r>
+              <w:rPr>
+                <w:b/>
+                <w:sz w:val="19"/>
+              </w:rPr>
+              <w:t>🔒 Cómo cuadrar a mano</w:t>
+              <w:br/>
+            </w:r>
+            <w:r>
+              <w:rPr>
+                <w:sz w:val="19"/>
+              </w:rPr>
+              <w:t>Monto de la ODP = saldo + fijos si es AutoFin (los fijos están en Parámetros de Crédito). Vencimiento = fecha de recepción de fundantes (o el día hábil siguiente si fue después de las 14:00) + horas de la categoría ÷ 24 en días hábiles. Cuenta de paso = lo recibido menos lo pagado, por ODP completa; si no cuadra, buscar un ingreso asentado por un monto distinto al de su ODP.</w:t>
+            </w:r>
+          </w:p>
+        </w:tc>
+      </w:tr>
+    </w:tbl>
+    <w:p>
+      <w:pPr>
+        <w:spacing w:after="40"/>
+      </w:pPr>
+    </w:p>
     <w:tbl>
       <w:tblPr>
         <w:tblStyle w:val="TableGrid"/>
@@ -6754,6 +7862,1189 @@
                 <w:sz w:val="18"/>
               </w:rPr>
               <w:t>justificación en el correo y en el documento</w:t>
+            </w:r>
+          </w:p>
+        </w:tc>
+      </w:tr>
+    </w:tbl>
+    <w:p>
+      <w:pPr>
+        <w:spacing w:after="40"/>
+      </w:pPr>
+    </w:p>
+    <w:p>
+      <w:pPr>
+        <w:pStyle w:val="Heading2"/>
+      </w:pPr>
+      <w:r>
+        <w:t>14.1 Fórmulas y criterios de cálculo de la comisión del dealer</w:t>
+      </w:r>
+    </w:p>
+    <w:p>
+      <w:pPr>
+        <w:spacing w:after="80"/>
+      </w:pPr>
+      <w:r>
+        <w:rPr>
+          <w:b w:val="0"/>
+          <w:i w:val="0"/>
+        </w:rPr>
+        <w:t>Motor único isomorfo /js/comision-dealer.js (comisionDealer, comisionDealerEfectiva) para guardar la operación, recalcular el mes, la carta de aprobación y la rentabilidad; desglose de impuestos con /js/desglose-impuesto.js (AF_IMPUESTO). Tablas: dealer_comisiones (por dealer y ubicación), parametros_credito (pizarra), impuestos.</w:t>
+      </w:r>
+    </w:p>
+    <w:tbl>
+      <w:tblPr>
+        <w:tblStyle w:val="TableGrid"/>
+        <w:tblW w:type="auto" w:w="0"/>
+        <w:jc w:val="center"/>
+        <w:tblLook w:firstColumn="1" w:firstRow="1" w:lastColumn="0" w:lastRow="0" w:noHBand="0" w:noVBand="1" w:val="04A0"/>
+      </w:tblPr>
+      <w:tblGrid>
+        <w:gridCol w:w="3249"/>
+        <w:gridCol w:w="3249"/>
+        <w:gridCol w:w="3249"/>
+      </w:tblGrid>
+      <w:tr>
+        <w:tc>
+          <w:tcPr>
+            <w:tcW w:type="dxa" w:w="1928"/>
+            <w:shd w:val="clear" w:color="auto" w:fill="1F4E79"/>
+          </w:tcPr>
+          <w:p>
+            <w:r/>
+            <w:r>
+              <w:rPr>
+                <w:b/>
+                <w:color w:val="FFFFFF"/>
+                <w:sz w:val="18"/>
+              </w:rPr>
+              <w:t>Concepto</w:t>
+            </w:r>
+          </w:p>
+        </w:tc>
+        <w:tc>
+          <w:tcPr>
+            <w:tcW w:type="dxa" w:w="5443"/>
+            <w:shd w:val="clear" w:color="auto" w:fill="1F4E79"/>
+          </w:tcPr>
+          <w:p>
+            <w:r/>
+            <w:r>
+              <w:rPr>
+                <w:b/>
+                <w:color w:val="FFFFFF"/>
+                <w:sz w:val="18"/>
+              </w:rPr>
+              <w:t>Regla / fórmula</w:t>
+            </w:r>
+          </w:p>
+        </w:tc>
+        <w:tc>
+          <w:tcPr>
+            <w:tcW w:type="dxa" w:w="1984"/>
+            <w:shd w:val="clear" w:color="auto" w:fill="1F4E79"/>
+          </w:tcPr>
+          <w:p>
+            <w:r/>
+            <w:r>
+              <w:rPr>
+                <w:b/>
+                <w:color w:val="FFFFFF"/>
+                <w:sz w:val="18"/>
+              </w:rPr>
+              <w:t>Parámetro / fuente</w:t>
+            </w:r>
+          </w:p>
+        </w:tc>
+      </w:tr>
+      <w:tr>
+        <w:tc>
+          <w:tcPr>
+            <w:tcW w:type="dxa" w:w="1928"/>
+          </w:tcPr>
+          <w:p>
+            <w:r/>
+            <w:r>
+              <w:rPr>
+                <w:sz w:val="18"/>
+              </w:rPr>
+              <w:t>Ubicación de la operación</w:t>
+            </w:r>
+          </w:p>
+        </w:tc>
+        <w:tc>
+          <w:tcPr>
+            <w:tcW w:type="dxa" w:w="5443"/>
+          </w:tcPr>
+          <w:p>
+            <w:r/>
+            <w:r>
+              <w:rPr>
+                <w:sz w:val="18"/>
+              </w:rPr>
+              <w:t>el parque donde cursó (columna PARQUE de la op) o CALLE. Un dealer con RUT único puede tener N tablas, una por ubicación.</w:t>
+            </w:r>
+          </w:p>
+        </w:tc>
+        <w:tc>
+          <w:tcPr>
+            <w:tcW w:type="dxa" w:w="1984"/>
+          </w:tcPr>
+          <w:p>
+            <w:r/>
+            <w:r>
+              <w:rPr>
+                <w:sz w:val="18"/>
+              </w:rPr>
+              <w:t>creditos.parque · dealer_comisiones.ubicacion</w:t>
+            </w:r>
+          </w:p>
+        </w:tc>
+      </w:tr>
+      <w:tr>
+        <w:tc>
+          <w:tcPr>
+            <w:tcW w:type="dxa" w:w="1928"/>
+          </w:tcPr>
+          <w:p>
+            <w:r/>
+            <w:r>
+              <w:rPr>
+                <w:sz w:val="18"/>
+              </w:rPr>
+              <w:t>Tramo por plazo</w:t>
+            </w:r>
+          </w:p>
+        </w:tc>
+        <w:tc>
+          <w:tcPr>
+            <w:tcW w:type="dxa" w:w="5443"/>
+          </w:tcPr>
+          <w:p>
+            <w:r/>
+            <w:r>
+              <w:rPr>
+                <w:sz w:val="18"/>
+              </w:rPr>
+              <w:t>≤ 12 cuotas → com_6_12 · 13–24 → com_13_24 · 25–36 → com_25_36 · 37+ → com_37.</w:t>
+            </w:r>
+          </w:p>
+        </w:tc>
+        <w:tc>
+          <w:tcPr>
+            <w:tcW w:type="dxa" w:w="1984"/>
+          </w:tcPr>
+          <w:p>
+            <w:r/>
+            <w:r>
+              <w:rPr>
+                <w:sz w:val="18"/>
+              </w:rPr>
+              <w:t>dealer_comisiones</w:t>
+            </w:r>
+          </w:p>
+        </w:tc>
+      </w:tr>
+      <w:tr>
+        <w:tc>
+          <w:tcPr>
+            <w:tcW w:type="dxa" w:w="1928"/>
+          </w:tcPr>
+          <w:p>
+            <w:r/>
+            <w:r>
+              <w:rPr>
+                <w:sz w:val="18"/>
+              </w:rPr>
+              <w:t>% aplicable (precedencia)</w:t>
+            </w:r>
+          </w:p>
+        </w:tc>
+        <w:tc>
+          <w:tcPr>
+            <w:tcW w:type="dxa" w:w="5443"/>
+          </w:tcPr>
+          <w:p>
+            <w:r/>
+            <w:r>
+              <w:rPr>
+                <w:sz w:val="18"/>
+              </w:rPr>
+              <w:t>tabla del dealer para esa ubicación → tabla legacy de la ficha (parque/calle) → pizarra de Parámetros de Crédito (dealer_pct_* o dealer_calle_pct_*). La calle paga más % porque no hay comisión de parque.</w:t>
+            </w:r>
+          </w:p>
+        </w:tc>
+        <w:tc>
+          <w:tcPr>
+            <w:tcW w:type="dxa" w:w="1984"/>
+          </w:tcPr>
+          <w:p>
+            <w:r/>
+            <w:r>
+              <w:rPr>
+                <w:sz w:val="18"/>
+              </w:rPr>
+              <w:t>pizarra = semilla al crear la ficha</w:t>
+            </w:r>
+          </w:p>
+        </w:tc>
+      </w:tr>
+      <w:tr>
+        <w:tc>
+          <w:tcPr>
+            <w:tcW w:type="dxa" w:w="1928"/>
+          </w:tcPr>
+          <w:p>
+            <w:r/>
+            <w:r>
+              <w:rPr>
+                <w:sz w:val="18"/>
+              </w:rPr>
+              <w:t>Comisión calculada</w:t>
+            </w:r>
+          </w:p>
+        </w:tc>
+        <w:tc>
+          <w:tcPr>
+            <w:tcW w:type="dxa" w:w="5443"/>
+          </w:tcPr>
+          <w:p>
+            <w:r/>
+            <w:r>
+              <w:rPr>
+                <w:sz w:val="18"/>
+              </w:rPr>
+              <w:t>comdea_real = redondeo( saldo precio × % ). Es BRUTA: IVA incluido.</w:t>
+            </w:r>
+          </w:p>
+        </w:tc>
+        <w:tc>
+          <w:tcPr>
+            <w:tcW w:type="dxa" w:w="1984"/>
+          </w:tcPr>
+          <w:p>
+            <w:r/>
+            <w:r>
+              <w:rPr>
+                <w:sz w:val="18"/>
+              </w:rPr>
+              <w:t>creditos.comdea_real</w:t>
+            </w:r>
+          </w:p>
+        </w:tc>
+      </w:tr>
+      <w:tr>
+        <w:tc>
+          <w:tcPr>
+            <w:tcW w:type="dxa" w:w="1928"/>
+          </w:tcPr>
+          <w:p>
+            <w:r/>
+            <w:r>
+              <w:rPr>
+                <w:sz w:val="18"/>
+              </w:rPr>
+              <w:t>La carta manda hacia abajo</w:t>
+            </w:r>
+          </w:p>
+        </w:tc>
+        <w:tc>
+          <w:tcPr>
+            <w:tcW w:type="dxa" w:w="5443"/>
+          </w:tcPr>
+          <w:p>
+            <w:r/>
+            <w:r>
+              <w:rPr>
+                <w:sz w:val="18"/>
+              </w:rPr>
+              <w:t>comisión efectiva = forzada a mano &gt; carta si su % pactado (part_bruto ÷ saldo de la carta) es MENOR que el de la tabla, aplicado al saldo vigente &gt; cálculo. Excepción: una comisión CORREGIDA (Corrección de Cartas) manda en ambos sentidos.</w:t>
+            </w:r>
+          </w:p>
+        </w:tc>
+        <w:tc>
+          <w:tcPr>
+            <w:tcW w:type="dxa" w:w="1984"/>
+          </w:tcPr>
+          <w:p>
+            <w:r/>
+            <w:r>
+              <w:rPr>
+                <w:sz w:val="18"/>
+              </w:rPr>
+              <w:t>comisionDealerEfectiva</w:t>
+            </w:r>
+          </w:p>
+        </w:tc>
+      </w:tr>
+      <w:tr>
+        <w:tc>
+          <w:tcPr>
+            <w:tcW w:type="dxa" w:w="1928"/>
+          </w:tcPr>
+          <w:p>
+            <w:r/>
+            <w:r>
+              <w:rPr>
+                <w:sz w:val="18"/>
+              </w:rPr>
+              <w:t>Comisión del parque (si la op cursó en parque)</w:t>
+            </w:r>
+          </w:p>
+        </w:tc>
+        <w:tc>
+          <w:tcPr>
+            <w:tcW w:type="dxa" w:w="5443"/>
+          </w:tcPr>
+          <w:p>
+            <w:r/>
+            <w:r>
+              <w:rPr>
+                <w:sz w:val="18"/>
+              </w:rPr>
+              <w:t>com_parque = redondeo( saldo × comision_pct del parque ) (o patio_pct de la pizarra); es otra magnitud, para el dueño del parque, no se fusiona con la del dealer.</w:t>
+            </w:r>
+          </w:p>
+        </w:tc>
+        <w:tc>
+          <w:tcPr>
+            <w:tcW w:type="dxa" w:w="1984"/>
+          </w:tcPr>
+          <w:p>
+            <w:r/>
+            <w:r>
+              <w:rPr>
+                <w:sz w:val="18"/>
+              </w:rPr>
+              <w:t>parques_comisiones.comision_pct</w:t>
+            </w:r>
+          </w:p>
+        </w:tc>
+      </w:tr>
+      <w:tr>
+        <w:tc>
+          <w:tcPr>
+            <w:tcW w:type="dxa" w:w="1928"/>
+          </w:tcPr>
+          <w:p>
+            <w:r/>
+            <w:r>
+              <w:rPr>
+                <w:sz w:val="18"/>
+              </w:rPr>
+              <w:t>Total de la cartola</w:t>
+            </w:r>
+          </w:p>
+        </w:tc>
+        <w:tc>
+          <w:tcPr>
+            <w:tcW w:type="dxa" w:w="5443"/>
+          </w:tcPr>
+          <w:p>
+            <w:r/>
+            <w:r>
+              <w:rPr>
+                <w:sz w:val="18"/>
+              </w:rPr>
+              <w:t>Σ comisiones efectivas de las ops A PAGAR − Σ A DESCONTAR ± adicionales y descuentos aprobados en Detalle Mes.</w:t>
+            </w:r>
+          </w:p>
+        </w:tc>
+        <w:tc>
+          <w:tcPr>
+            <w:tcW w:type="dxa" w:w="1984"/>
+          </w:tcPr>
+          <w:p>
+            <w:r/>
+            <w:r>
+              <w:rPr>
+                <w:sz w:val="18"/>
+              </w:rPr>
+              <w:t>cartolas_movimientos</w:t>
+            </w:r>
+          </w:p>
+        </w:tc>
+      </w:tr>
+      <w:tr>
+        <w:tc>
+          <w:tcPr>
+            <w:tcW w:type="dxa" w:w="1928"/>
+          </w:tcPr>
+          <w:p>
+            <w:r/>
+            <w:r>
+              <w:rPr>
+                <w:sz w:val="18"/>
+              </w:rPr>
+              <w:t>Factura afecta</w:t>
+            </w:r>
+          </w:p>
+        </w:tc>
+        <w:tc>
+          <w:tcPr>
+            <w:tcW w:type="dxa" w:w="5443"/>
+          </w:tcPr>
+          <w:p>
+            <w:r/>
+            <w:r>
+              <w:rPr>
+                <w:sz w:val="18"/>
+              </w:rPr>
+              <w:t>neto = bruto ÷ (1 + IVA) · IVA = bruto − neto · a pagar = bruto. La comisión ya trae el IVA: nunca se suma encima.</w:t>
+            </w:r>
+          </w:p>
+        </w:tc>
+        <w:tc>
+          <w:tcPr>
+            <w:tcW w:type="dxa" w:w="1984"/>
+          </w:tcPr>
+          <w:p>
+            <w:r/>
+            <w:r>
+              <w:rPr>
+                <w:sz w:val="18"/>
+              </w:rPr>
+              <w:t>impuestos.IVA 19%</w:t>
+            </w:r>
+          </w:p>
+        </w:tc>
+      </w:tr>
+      <w:tr>
+        <w:tc>
+          <w:tcPr>
+            <w:tcW w:type="dxa" w:w="1928"/>
+          </w:tcPr>
+          <w:p>
+            <w:r/>
+            <w:r>
+              <w:rPr>
+                <w:sz w:val="18"/>
+              </w:rPr>
+              <w:t>Boleta de honorarios</w:t>
+            </w:r>
+          </w:p>
+        </w:tc>
+        <w:tc>
+          <w:tcPr>
+            <w:tcW w:type="dxa" w:w="5443"/>
+          </w:tcPr>
+          <w:p>
+            <w:r/>
+            <w:r>
+              <w:rPr>
+                <w:sz w:val="18"/>
+              </w:rPr>
+              <w:t>base = bruto · retención = bruto × % · a pagar = bruto − retención (la retención es pasivo con el SII, va al F29).</w:t>
+            </w:r>
+          </w:p>
+        </w:tc>
+        <w:tc>
+          <w:tcPr>
+            <w:tcW w:type="dxa" w:w="1984"/>
+          </w:tcPr>
+          <w:p>
+            <w:r/>
+            <w:r>
+              <w:rPr>
+                <w:sz w:val="18"/>
+              </w:rPr>
+              <w:t>impuestos.RETENCION_HONORARIOS 15,25%</w:t>
+            </w:r>
+          </w:p>
+        </w:tc>
+      </w:tr>
+      <w:tr>
+        <w:tc>
+          <w:tcPr>
+            <w:tcW w:type="dxa" w:w="1928"/>
+          </w:tcPr>
+          <w:p>
+            <w:r/>
+            <w:r>
+              <w:rPr>
+                <w:sz w:val="18"/>
+              </w:rPr>
+              <w:t>Cuadre de la ODP</w:t>
+            </w:r>
+          </w:p>
+        </w:tc>
+        <w:tc>
+          <w:tcPr>
+            <w:tcW w:type="dxa" w:w="5443"/>
+          </w:tcPr>
+          <w:p>
+            <w:r/>
+            <w:r>
+              <w:rPr>
+                <w:sz w:val="18"/>
+              </w:rPr>
+              <w:t>|Σ comisiones de la factura − total de la factura| ≤ $1; si no, justificación obligatoria (≥ 15 caracteres).</w:t>
+            </w:r>
+          </w:p>
+        </w:tc>
+        <w:tc>
+          <w:tcPr>
+            <w:tcW w:type="dxa" w:w="1984"/>
+          </w:tcPr>
+          <w:p>
+            <w:r/>
+            <w:r>
+              <w:rPr>
+                <w:sz w:val="18"/>
+              </w:rPr>
+              <w:t>orden-pago-comision</w:t>
+            </w:r>
+          </w:p>
+        </w:tc>
+      </w:tr>
+      <w:tr>
+        <w:tc>
+          <w:tcPr>
+            <w:tcW w:type="dxa" w:w="1928"/>
+          </w:tcPr>
+          <w:p>
+            <w:r/>
+            <w:r>
+              <w:rPr>
+                <w:sz w:val="18"/>
+              </w:rPr>
+              <w:t>Plan Liquidez</w:t>
+            </w:r>
+          </w:p>
+        </w:tc>
+        <w:tc>
+          <w:tcPr>
+            <w:tcW w:type="dxa" w:w="5443"/>
+          </w:tcPr>
+          <w:p>
+            <w:r/>
+            <w:r>
+              <w:rPr>
+                <w:sz w:val="18"/>
+              </w:rPr>
+              <w:t>a pagar = bruto (o líquido) − cuota del Plan Liquidez del dealer; el descuento va en la ODP, nunca en la cartola.</w:t>
+            </w:r>
+          </w:p>
+        </w:tc>
+        <w:tc>
+          <w:tcPr>
+            <w:tcW w:type="dxa" w:w="1984"/>
+          </w:tcPr>
+          <w:p>
+            <w:r/>
+            <w:r>
+              <w:rPr>
+                <w:sz w:val="18"/>
+              </w:rPr>
+              <w:t>plan_liquidez</w:t>
+            </w:r>
+          </w:p>
+        </w:tc>
+      </w:tr>
+      <w:tr>
+        <w:tc>
+          <w:tcPr>
+            <w:tcW w:type="dxa" w:w="1928"/>
+          </w:tcPr>
+          <w:p>
+            <w:r/>
+            <w:r>
+              <w:rPr>
+                <w:sz w:val="18"/>
+              </w:rPr>
+              <w:t>Corte de la cartola</w:t>
+            </w:r>
+          </w:p>
+        </w:tc>
+        <w:tc>
+          <w:tcPr>
+            <w:tcW w:type="dxa" w:w="5443"/>
+          </w:tcPr>
+          <w:p>
+            <w:r/>
+            <w:r>
+              <w:rPr>
+                <w:sz w:val="18"/>
+              </w:rPr>
+              <w:t>entra a la cartola del mes M lo A PAGAR con estado_fecha ≤ último día de M−1 (MES_ANTERIOR); lo marcado dentro de M se difiere. INMEDIATO = entra todo.</w:t>
+            </w:r>
+          </w:p>
+        </w:tc>
+        <w:tc>
+          <w:tcPr>
+            <w:tcW w:type="dxa" w:w="1984"/>
+          </w:tcPr>
+          <w:p>
+            <w:r/>
+            <w:r>
+              <w:rPr>
+                <w:sz w:val="18"/>
+              </w:rPr>
+              <w:t>cartola_corte_marcado</w:t>
+            </w:r>
+          </w:p>
+        </w:tc>
+      </w:tr>
+      <w:tr>
+        <w:tc>
+          <w:tcPr>
+            <w:tcW w:type="dxa" w:w="1928"/>
+          </w:tcPr>
+          <w:p>
+            <w:r/>
+            <w:r>
+              <w:rPr>
+                <w:sz w:val="18"/>
+              </w:rPr>
+              <w:t>Momento COMISIÓN A PAGAR</w:t>
+            </w:r>
+          </w:p>
+        </w:tc>
+        <w:tc>
+          <w:tcPr>
+            <w:tcW w:type="dxa" w:w="5443"/>
+          </w:tcPr>
+          <w:p>
+            <w:r/>
+            <w:r>
+              <w:rPr>
+                <w:sz w:val="18"/>
+              </w:rPr>
+              <w:t>CIERRE_MES: el último día del mes 23:59 para toda op con FONDOS RECIBIDOS / SALDO PAGADO del mes. INMEDIATO: al marcar FONDOS RECIBIDOS.</w:t>
+            </w:r>
+          </w:p>
+        </w:tc>
+        <w:tc>
+          <w:tcPr>
+            <w:tcW w:type="dxa" w:w="1984"/>
+          </w:tcPr>
+          <w:p>
+            <w:r/>
+            <w:r>
+              <w:rPr>
+                <w:sz w:val="18"/>
+              </w:rPr>
+              <w:t>comision_a_pagar_momento</w:t>
+            </w:r>
+          </w:p>
+        </w:tc>
+      </w:tr>
+    </w:tbl>
+    <w:p>
+      <w:pPr>
+        <w:spacing w:after="40"/>
+      </w:pPr>
+    </w:p>
+    <w:p>
+      <w:pPr>
+        <w:spacing w:after="40"/>
+      </w:pPr>
+      <w:r>
+        <w:rPr>
+          <w:b/>
+          <w:i w:val="0"/>
+          <w:color w:val="1F4E79"/>
+        </w:rPr>
+        <w:t>Ejemplo numérico</w:t>
+      </w:r>
+    </w:p>
+    <w:tbl>
+      <w:tblPr>
+        <w:tblStyle w:val="TableGrid"/>
+        <w:tblW w:type="auto" w:w="0"/>
+        <w:jc w:val="center"/>
+        <w:tblLook w:firstColumn="1" w:firstRow="1" w:lastColumn="0" w:lastRow="0" w:noHBand="0" w:noVBand="1" w:val="04A0"/>
+      </w:tblPr>
+      <w:tblGrid>
+        <w:gridCol w:w="3249"/>
+        <w:gridCol w:w="3249"/>
+        <w:gridCol w:w="3249"/>
+      </w:tblGrid>
+      <w:tr>
+        <w:tc>
+          <w:tcPr>
+            <w:tcW w:type="dxa" w:w="2721"/>
+            <w:shd w:val="clear" w:color="auto" w:fill="1F4E79"/>
+          </w:tcPr>
+          <w:p>
+            <w:r/>
+            <w:r>
+              <w:rPr>
+                <w:b/>
+                <w:color w:val="FFFFFF"/>
+                <w:sz w:val="18"/>
+              </w:rPr>
+              <w:t>Caso</w:t>
+            </w:r>
+          </w:p>
+        </w:tc>
+        <w:tc>
+          <w:tcPr>
+            <w:tcW w:type="dxa" w:w="4649"/>
+            <w:shd w:val="clear" w:color="auto" w:fill="1F4E79"/>
+          </w:tcPr>
+          <w:p>
+            <w:r/>
+            <w:r>
+              <w:rPr>
+                <w:b/>
+                <w:color w:val="FFFFFF"/>
+                <w:sz w:val="18"/>
+              </w:rPr>
+              <w:t>Cálculo</w:t>
+            </w:r>
+          </w:p>
+        </w:tc>
+        <w:tc>
+          <w:tcPr>
+            <w:tcW w:type="dxa" w:w="1984"/>
+            <w:shd w:val="clear" w:color="auto" w:fill="1F4E79"/>
+          </w:tcPr>
+          <w:p>
+            <w:r/>
+            <w:r>
+              <w:rPr>
+                <w:b/>
+                <w:color w:val="FFFFFF"/>
+                <w:sz w:val="18"/>
+              </w:rPr>
+              <w:t>Resultado</w:t>
+            </w:r>
+          </w:p>
+        </w:tc>
+      </w:tr>
+      <w:tr>
+        <w:tc>
+          <w:tcPr>
+            <w:tcW w:type="dxa" w:w="2721"/>
+          </w:tcPr>
+          <w:p>
+            <w:r/>
+            <w:r>
+              <w:rPr>
+                <w:sz w:val="18"/>
+              </w:rPr>
+              <w:t>Op de calle, saldo $9.000.000, 36 cuotas; tabla CALLE del dealer: 25–36 = 5,5%</w:t>
+            </w:r>
+          </w:p>
+        </w:tc>
+        <w:tc>
+          <w:tcPr>
+            <w:tcW w:type="dxa" w:w="4649"/>
+          </w:tcPr>
+          <w:p>
+            <w:r/>
+            <w:r>
+              <w:rPr>
+                <w:sz w:val="18"/>
+              </w:rPr>
+              <w:t>9.000.000 × 5,5%</w:t>
+            </w:r>
+          </w:p>
+        </w:tc>
+        <w:tc>
+          <w:tcPr>
+            <w:tcW w:type="dxa" w:w="1984"/>
+          </w:tcPr>
+          <w:p>
+            <w:r/>
+            <w:r>
+              <w:rPr>
+                <w:sz w:val="18"/>
+              </w:rPr>
+              <w:t>comisión bruta $495.000</w:t>
+            </w:r>
+          </w:p>
+        </w:tc>
+      </w:tr>
+      <w:tr>
+        <w:tc>
+          <w:tcPr>
+            <w:tcW w:type="dxa" w:w="2721"/>
+          </w:tcPr>
+          <w:p>
+            <w:r/>
+            <w:r>
+              <w:rPr>
+                <w:sz w:val="18"/>
+              </w:rPr>
+              <w:t>Misma op cursada en el parque Maipú; tabla MAIPÚ del dealer: 25–36 = 4,0%; parque comision_pct 1,2%</w:t>
+            </w:r>
+          </w:p>
+        </w:tc>
+        <w:tc>
+          <w:tcPr>
+            <w:tcW w:type="dxa" w:w="4649"/>
+          </w:tcPr>
+          <w:p>
+            <w:r/>
+            <w:r>
+              <w:rPr>
+                <w:sz w:val="18"/>
+              </w:rPr>
+              <w:t>dealer 9.000.000 × 4,0% = 360.000 · parque 9.000.000 × 1,2% = 108.000</w:t>
+            </w:r>
+          </w:p>
+        </w:tc>
+        <w:tc>
+          <w:tcPr>
+            <w:tcW w:type="dxa" w:w="1984"/>
+          </w:tcPr>
+          <w:p>
+            <w:r/>
+            <w:r>
+              <w:rPr>
+                <w:sz w:val="18"/>
+              </w:rPr>
+              <w:t>dealer $360.000 · parque $108.000</w:t>
+            </w:r>
+          </w:p>
+        </w:tc>
+      </w:tr>
+      <w:tr>
+        <w:tc>
+          <w:tcPr>
+            <w:tcW w:type="dxa" w:w="2721"/>
+          </w:tcPr>
+          <w:p>
+            <w:r/>
+            <w:r>
+              <w:rPr>
+                <w:sz w:val="18"/>
+              </w:rPr>
+              <w:t>La carta pactó $315.000 sobre un saldo de carta de $9.000.000 (3,5%)</w:t>
+            </w:r>
+          </w:p>
+        </w:tc>
+        <w:tc>
+          <w:tcPr>
+            <w:tcW w:type="dxa" w:w="4649"/>
+          </w:tcPr>
+          <w:p>
+            <w:r/>
+            <w:r>
+              <w:rPr>
+                <w:sz w:val="18"/>
+              </w:rPr>
+              <w:t>3,5% &lt; 4,0% → manda la carta: 9.000.000 × 3,5%</w:t>
+            </w:r>
+          </w:p>
+        </w:tc>
+        <w:tc>
+          <w:tcPr>
+            <w:tcW w:type="dxa" w:w="1984"/>
+          </w:tcPr>
+          <w:p>
+            <w:r/>
+            <w:r>
+              <w:rPr>
+                <w:sz w:val="18"/>
+              </w:rPr>
+              <w:t>$315.000</w:t>
+            </w:r>
+          </w:p>
+        </w:tc>
+      </w:tr>
+      <w:tr>
+        <w:tc>
+          <w:tcPr>
+            <w:tcW w:type="dxa" w:w="2721"/>
+          </w:tcPr>
+          <w:p>
+            <w:r/>
+            <w:r>
+              <w:rPr>
+                <w:sz w:val="18"/>
+              </w:rPr>
+              <w:t>El saldo subió a $9.500.000 con la última carga</w:t>
+            </w:r>
+          </w:p>
+        </w:tc>
+        <w:tc>
+          <w:tcPr>
+            <w:tcW w:type="dxa" w:w="4649"/>
+          </w:tcPr>
+          <w:p>
+            <w:r/>
+            <w:r>
+              <w:rPr>
+                <w:sz w:val="18"/>
+              </w:rPr>
+              <w:t>se mantiene el % negociado: 9.500.000 × 3,5% (no los $315.000 viejos)</w:t>
+            </w:r>
+          </w:p>
+        </w:tc>
+        <w:tc>
+          <w:tcPr>
+            <w:tcW w:type="dxa" w:w="1984"/>
+          </w:tcPr>
+          <w:p>
+            <w:r/>
+            <w:r>
+              <w:rPr>
+                <w:sz w:val="18"/>
+              </w:rPr>
+              <w:t>$332.500</w:t>
+            </w:r>
+          </w:p>
+        </w:tc>
+      </w:tr>
+      <w:tr>
+        <w:tc>
+          <w:tcPr>
+            <w:tcW w:type="dxa" w:w="2721"/>
+          </w:tcPr>
+          <w:p>
+            <w:r/>
+            <w:r>
+              <w:rPr>
+                <w:sz w:val="18"/>
+              </w:rPr>
+              <w:t>La carta pactó 4,5% (más que la tabla)</w:t>
+            </w:r>
+          </w:p>
+        </w:tc>
+        <w:tc>
+          <w:tcPr>
+            <w:tcW w:type="dxa" w:w="4649"/>
+          </w:tcPr>
+          <w:p>
+            <w:r/>
+            <w:r>
+              <w:rPr>
+                <w:sz w:val="18"/>
+              </w:rPr>
+              <w:t>la carta no manda hacia arriba → tabla 4,0%</w:t>
+            </w:r>
+          </w:p>
+        </w:tc>
+        <w:tc>
+          <w:tcPr>
+            <w:tcW w:type="dxa" w:w="1984"/>
+          </w:tcPr>
+          <w:p>
+            <w:r/>
+            <w:r>
+              <w:rPr>
+                <w:sz w:val="18"/>
+              </w:rPr>
+              <w:t>$380.000 (salvo comisión corregida)</w:t>
+            </w:r>
+          </w:p>
+        </w:tc>
+      </w:tr>
+      <w:tr>
+        <w:tc>
+          <w:tcPr>
+            <w:tcW w:type="dxa" w:w="2721"/>
+          </w:tcPr>
+          <w:p>
+            <w:r/>
+            <w:r>
+              <w:rPr>
+                <w:sz w:val="18"/>
+              </w:rPr>
+              <w:t>Cartola del dealer (3 ops brutas 495.000 + 380.000 + 315.000)</w:t>
+            </w:r>
+          </w:p>
+        </w:tc>
+        <w:tc>
+          <w:tcPr>
+            <w:tcW w:type="dxa" w:w="4649"/>
+          </w:tcPr>
+          <w:p>
+            <w:r/>
+            <w:r>
+              <w:rPr>
+                <w:sz w:val="18"/>
+              </w:rPr>
+              <w:t>sin descuentos</w:t>
+            </w:r>
+          </w:p>
+        </w:tc>
+        <w:tc>
+          <w:tcPr>
+            <w:tcW w:type="dxa" w:w="1984"/>
+          </w:tcPr>
+          <w:p>
+            <w:r/>
+            <w:r>
+              <w:rPr>
+                <w:sz w:val="18"/>
+              </w:rPr>
+              <w:t>total $1.190.000</w:t>
+            </w:r>
+          </w:p>
+        </w:tc>
+      </w:tr>
+      <w:tr>
+        <w:tc>
+          <w:tcPr>
+            <w:tcW w:type="dxa" w:w="2721"/>
+          </w:tcPr>
+          <w:p>
+            <w:r/>
+            <w:r>
+              <w:rPr>
+                <w:sz w:val="18"/>
+              </w:rPr>
+              <w:t>Factura afecta por 1.190.000</w:t>
+            </w:r>
+          </w:p>
+        </w:tc>
+        <w:tc>
+          <w:tcPr>
+            <w:tcW w:type="dxa" w:w="4649"/>
+          </w:tcPr>
+          <w:p>
+            <w:r/>
+            <w:r>
+              <w:rPr>
+                <w:sz w:val="18"/>
+              </w:rPr>
+              <w:t>neto 1.190.000 ÷ 1,19 = 1.000.000 · IVA 190.000 · a pagar 1.190.000</w:t>
+            </w:r>
+          </w:p>
+        </w:tc>
+        <w:tc>
+          <w:tcPr>
+            <w:tcW w:type="dxa" w:w="1984"/>
+          </w:tcPr>
+          <w:p>
+            <w:r/>
+            <w:r>
+              <w:rPr>
+                <w:sz w:val="18"/>
+              </w:rPr>
+              <w:t>ODP $1.190.000</w:t>
+            </w:r>
+          </w:p>
+        </w:tc>
+      </w:tr>
+      <w:tr>
+        <w:tc>
+          <w:tcPr>
+            <w:tcW w:type="dxa" w:w="2721"/>
+          </w:tcPr>
+          <w:p>
+            <w:r/>
+            <w:r>
+              <w:rPr>
+                <w:sz w:val="18"/>
+              </w:rPr>
+              <w:t>Boleta de honorarios por 1.190.000</w:t>
+            </w:r>
+          </w:p>
+        </w:tc>
+        <w:tc>
+          <w:tcPr>
+            <w:tcW w:type="dxa" w:w="4649"/>
+          </w:tcPr>
+          <w:p>
+            <w:r/>
+            <w:r>
+              <w:rPr>
+                <w:sz w:val="18"/>
+              </w:rPr>
+              <w:t>retención 1.190.000 × 15,25% = 181.475 · a pagar 1.008.525</w:t>
+            </w:r>
+          </w:p>
+        </w:tc>
+        <w:tc>
+          <w:tcPr>
+            <w:tcW w:type="dxa" w:w="1984"/>
+          </w:tcPr>
+          <w:p>
+            <w:r/>
+            <w:r>
+              <w:rPr>
+                <w:sz w:val="18"/>
+              </w:rPr>
+              <w:t>ODP $1.008.525</w:t>
+            </w:r>
+          </w:p>
+        </w:tc>
+      </w:tr>
+      <w:tr>
+        <w:tc>
+          <w:tcPr>
+            <w:tcW w:type="dxa" w:w="2721"/>
+          </w:tcPr>
+          <w:p>
+            <w:r/>
+            <w:r>
+              <w:rPr>
+                <w:sz w:val="18"/>
+              </w:rPr>
+              <w:t>Op otorgada el 20-08, fondos recibidos el 09-09</w:t>
+            </w:r>
+          </w:p>
+        </w:tc>
+        <w:tc>
+          <w:tcPr>
+            <w:tcW w:type="dxa" w:w="4649"/>
+          </w:tcPr>
+          <w:p>
+            <w:r/>
+            <w:r>
+              <w:rPr>
+                <w:sz w:val="18"/>
+              </w:rPr>
+              <w:t>COMISIÓN A PAGAR el 30-09 (cierre de mes) → con corte MES_ANTERIOR entra a la cartola de octubre, no a la de septiembre</w:t>
+            </w:r>
+          </w:p>
+        </w:tc>
+        <w:tc>
+          <w:tcPr>
+            <w:tcW w:type="dxa" w:w="1984"/>
+          </w:tcPr>
+          <w:p>
+            <w:r/>
+            <w:r>
+              <w:rPr>
+                <w:sz w:val="18"/>
+              </w:rPr>
+              <w:t>diferida (aviso ámbar)</w:t>
+            </w:r>
+          </w:p>
+        </w:tc>
+      </w:tr>
+    </w:tbl>
+    <w:p>
+      <w:pPr>
+        <w:spacing w:after="40"/>
+      </w:pPr>
+    </w:p>
+    <w:tbl>
+      <w:tblPr>
+        <w:tblStyle w:val="TableGrid"/>
+        <w:tblW w:type="auto" w:w="0"/>
+        <w:tblLook w:firstColumn="1" w:firstRow="1" w:lastColumn="0" w:lastRow="0" w:noHBand="0" w:noVBand="1" w:val="04A0"/>
+      </w:tblPr>
+      <w:tblGrid>
+        <w:gridCol w:w="9746"/>
+      </w:tblGrid>
+      <w:tr>
+        <w:tc>
+          <w:tcPr>
+            <w:tcW w:type="dxa" w:w="9746"/>
+            <w:shd w:val="clear" w:color="auto" w:fill="E8F0F8"/>
+          </w:tcPr>
+          <w:p>
+            <w:r/>
+            <w:r>
+              <w:rPr>
+                <w:b/>
+                <w:sz w:val="19"/>
+              </w:rPr>
+              <w:t>🔒 Cómo cuadrar a mano</w:t>
+              <w:br/>
+            </w:r>
+            <w:r>
+              <w:rPr>
+                <w:sz w:val="19"/>
+              </w:rPr>
+              <w:t>Comisión = saldo × % del tramo de la tabla del dealer para la ubicación de la op (Mantenedores → Dealers → Locales y comisión por local); si la carta pactó un % menor, ese. La cartola es la suma de lo A PAGAR menos lo A DESCONTAR. La factura debe venir por ese bruto: neto = bruto ÷ 1,19. Si la ODP avisa que no cuadra, comparar op por op la comisión efectiva (Revisión de Cartas → Detalle Mes) contra la factura antes de justificar.</w:t>
             </w:r>
           </w:p>
         </w:tc>
@@ -8565,6 +10856,1013 @@
                 <w:sz w:val="18"/>
               </w:rPr>
               <w:t>sin pérdida</w:t>
+            </w:r>
+          </w:p>
+        </w:tc>
+      </w:tr>
+    </w:tbl>
+    <w:p>
+      <w:pPr>
+        <w:spacing w:after="40"/>
+      </w:pPr>
+    </w:p>
+    <w:p>
+      <w:pPr>
+        <w:pStyle w:val="Heading2"/>
+      </w:pPr>
+      <w:r>
+        <w:t>19.1 Fórmulas y criterios de cálculo de la comisión del parque</w:t>
+      </w:r>
+    </w:p>
+    <w:p>
+      <w:pPr>
+        <w:spacing w:after="80"/>
+      </w:pPr>
+      <w:r>
+        <w:rPr>
+          <w:b w:val="0"/>
+          <w:i w:val="0"/>
+        </w:rPr>
+        <w:t>Motores: comisionDealer (com_parque), calcularMes de cartolas-parque (universo y foto), parques_comisiones (arriendo y %), recalcular-mes (prorrateo del arriendo para rentabilidad).</w:t>
+      </w:r>
+    </w:p>
+    <w:tbl>
+      <w:tblPr>
+        <w:tblStyle w:val="TableGrid"/>
+        <w:tblW w:type="auto" w:w="0"/>
+        <w:jc w:val="center"/>
+        <w:tblLook w:firstColumn="1" w:firstRow="1" w:lastColumn="0" w:lastRow="0" w:noHBand="0" w:noVBand="1" w:val="04A0"/>
+      </w:tblPr>
+      <w:tblGrid>
+        <w:gridCol w:w="3249"/>
+        <w:gridCol w:w="3249"/>
+        <w:gridCol w:w="3249"/>
+      </w:tblGrid>
+      <w:tr>
+        <w:tc>
+          <w:tcPr>
+            <w:tcW w:type="dxa" w:w="1928"/>
+            <w:shd w:val="clear" w:color="auto" w:fill="1F4E79"/>
+          </w:tcPr>
+          <w:p>
+            <w:r/>
+            <w:r>
+              <w:rPr>
+                <w:b/>
+                <w:color w:val="FFFFFF"/>
+                <w:sz w:val="18"/>
+              </w:rPr>
+              <w:t>Concepto</w:t>
+            </w:r>
+          </w:p>
+        </w:tc>
+        <w:tc>
+          <w:tcPr>
+            <w:tcW w:type="dxa" w:w="5443"/>
+            <w:shd w:val="clear" w:color="auto" w:fill="1F4E79"/>
+          </w:tcPr>
+          <w:p>
+            <w:r/>
+            <w:r>
+              <w:rPr>
+                <w:b/>
+                <w:color w:val="FFFFFF"/>
+                <w:sz w:val="18"/>
+              </w:rPr>
+              <w:t>Regla / fórmula</w:t>
+            </w:r>
+          </w:p>
+        </w:tc>
+        <w:tc>
+          <w:tcPr>
+            <w:tcW w:type="dxa" w:w="1984"/>
+            <w:shd w:val="clear" w:color="auto" w:fill="1F4E79"/>
+          </w:tcPr>
+          <w:p>
+            <w:r/>
+            <w:r>
+              <w:rPr>
+                <w:b/>
+                <w:color w:val="FFFFFF"/>
+                <w:sz w:val="18"/>
+              </w:rPr>
+              <w:t>Parámetro / fuente</w:t>
+            </w:r>
+          </w:p>
+        </w:tc>
+      </w:tr>
+      <w:tr>
+        <w:tc>
+          <w:tcPr>
+            <w:tcW w:type="dxa" w:w="1928"/>
+          </w:tcPr>
+          <w:p>
+            <w:r/>
+            <w:r>
+              <w:rPr>
+                <w:sz w:val="18"/>
+              </w:rPr>
+              <w:t>Comisión por crédito</w:t>
+            </w:r>
+          </w:p>
+        </w:tc>
+        <w:tc>
+          <w:tcPr>
+            <w:tcW w:type="dxa" w:w="5443"/>
+          </w:tcPr>
+          <w:p>
+            <w:r/>
+            <w:r>
+              <w:rPr>
+                <w:sz w:val="18"/>
+              </w:rPr>
+              <w:t>com_parque = redondeo( saldo precio × comision_pct del parque ). Se calcula al guardar la op y al recalcular el mes; es la que cobra el parque.</w:t>
+            </w:r>
+          </w:p>
+        </w:tc>
+        <w:tc>
+          <w:tcPr>
+            <w:tcW w:type="dxa" w:w="1984"/>
+          </w:tcPr>
+          <w:p>
+            <w:r/>
+            <w:r>
+              <w:rPr>
+                <w:sz w:val="18"/>
+              </w:rPr>
+              <w:t>parques_comisiones.comision_pct</w:t>
+            </w:r>
+          </w:p>
+        </w:tc>
+      </w:tr>
+      <w:tr>
+        <w:tc>
+          <w:tcPr>
+            <w:tcW w:type="dxa" w:w="1928"/>
+          </w:tcPr>
+          <w:p>
+            <w:r/>
+            <w:r>
+              <w:rPr>
+                <w:sz w:val="18"/>
+              </w:rPr>
+              <w:t>Universo de la cartola del mes T</w:t>
+            </w:r>
+          </w:p>
+        </w:tc>
+        <w:tc>
+          <w:tcPr>
+            <w:tcW w:type="dxa" w:w="5443"/>
+          </w:tcPr>
+          <w:p>
+            <w:r/>
+            <w:r>
+              <w:rPr>
+                <w:sz w:val="18"/>
+              </w:rPr>
+              <w:t>ops OTORGADAS en T o antes, cursadas en ese parque (atribución contra el mantenedor: NO APLICA / CALLE quedan fuera), con comisión aún no cobrada y saldo precio ≥ LIBERADO A PAGO al cierre de T. Corte de partida paramétrico.</w:t>
+            </w:r>
+          </w:p>
+        </w:tc>
+        <w:tc>
+          <w:tcPr>
+            <w:tcW w:type="dxa" w:w="1984"/>
+          </w:tcPr>
+          <w:p>
+            <w:r/>
+            <w:r>
+              <w:rPr>
+                <w:sz w:val="18"/>
+              </w:rPr>
+              <w:t>parques_universo_desde</w:t>
+            </w:r>
+          </w:p>
+        </w:tc>
+      </w:tr>
+      <w:tr>
+        <w:tc>
+          <w:tcPr>
+            <w:tcW w:type="dxa" w:w="1928"/>
+          </w:tcPr>
+          <w:p>
+            <w:r/>
+            <w:r>
+              <w:rPr>
+                <w:sz w:val="18"/>
+              </w:rPr>
+              <w:t>Arriendo</w:t>
+            </w:r>
+          </w:p>
+        </w:tc>
+        <w:tc>
+          <w:tcPr>
+            <w:tcW w:type="dxa" w:w="5443"/>
+          </w:tcPr>
+          <w:p>
+            <w:r/>
+            <w:r>
+              <w:rPr>
+                <w:sz w:val="18"/>
+              </w:rPr>
+              <w:t>monto fijo mensual del parque. Si parques_arriendo_recurrente = 1 va por Pagos Recurrentes (ODP el día 6) y NO entra a la cartola; si es 0, es una línea más de la cartola.</w:t>
+            </w:r>
+          </w:p>
+        </w:tc>
+        <w:tc>
+          <w:tcPr>
+            <w:tcW w:type="dxa" w:w="1984"/>
+          </w:tcPr>
+          <w:p>
+            <w:r/>
+            <w:r>
+              <w:rPr>
+                <w:sz w:val="18"/>
+              </w:rPr>
+              <w:t>parques_comisiones.arriendo · parques_arriendo_recurrente</w:t>
+            </w:r>
+          </w:p>
+        </w:tc>
+      </w:tr>
+      <w:tr>
+        <w:tc>
+          <w:tcPr>
+            <w:tcW w:type="dxa" w:w="1928"/>
+          </w:tcPr>
+          <w:p>
+            <w:r/>
+            <w:r>
+              <w:rPr>
+                <w:sz w:val="18"/>
+              </w:rPr>
+              <w:t>Total de la cartola</w:t>
+            </w:r>
+          </w:p>
+        </w:tc>
+        <w:tc>
+          <w:tcPr>
+            <w:tcW w:type="dxa" w:w="5443"/>
+          </w:tcPr>
+          <w:p>
+            <w:r/>
+            <w:r>
+              <w:rPr>
+                <w:sz w:val="18"/>
+              </w:rPr>
+              <w:t>Σ com_parque de las ops del universo (+ arriendo si va en la cartola).</w:t>
+            </w:r>
+          </w:p>
+        </w:tc>
+        <w:tc>
+          <w:tcPr>
+            <w:tcW w:type="dxa" w:w="1984"/>
+          </w:tcPr>
+          <w:p>
+            <w:r/>
+            <w:r>
+              <w:rPr>
+                <w:sz w:val="18"/>
+              </w:rPr>
+              <w:t>foto por operación</w:t>
+            </w:r>
+          </w:p>
+        </w:tc>
+      </w:tr>
+      <w:tr>
+        <w:tc>
+          <w:tcPr>
+            <w:tcW w:type="dxa" w:w="1928"/>
+          </w:tcPr>
+          <w:p>
+            <w:r/>
+            <w:r>
+              <w:rPr>
+                <w:sz w:val="18"/>
+              </w:rPr>
+              <w:t>Foto congelada</w:t>
+            </w:r>
+          </w:p>
+        </w:tc>
+        <w:tc>
+          <w:tcPr>
+            <w:tcW w:type="dxa" w:w="5443"/>
+          </w:tcPr>
+          <w:p>
+            <w:r/>
+            <w:r>
+              <w:rPr>
+                <w:sz w:val="18"/>
+              </w:rPr>
+              <w:t>al aprobar quedan mes, op, monto y parque por fila: lo que se imprime, factura y paga. Una op no vuelve a cobrarse aunque cambie el saldo después.</w:t>
+            </w:r>
+          </w:p>
+        </w:tc>
+        <w:tc>
+          <w:tcPr>
+            <w:tcW w:type="dxa" w:w="1984"/>
+          </w:tcPr>
+          <w:p>
+            <w:r/>
+            <w:r>
+              <w:rPr>
+                <w:sz w:val="18"/>
+              </w:rPr>
+              <w:t>parques_pagos_mes · foto</w:t>
+            </w:r>
+          </w:p>
+        </w:tc>
+      </w:tr>
+      <w:tr>
+        <w:tc>
+          <w:tcPr>
+            <w:tcW w:type="dxa" w:w="1928"/>
+          </w:tcPr>
+          <w:p>
+            <w:r/>
+            <w:r>
+              <w:rPr>
+                <w:sz w:val="18"/>
+              </w:rPr>
+              <w:t>Factura del parque</w:t>
+            </w:r>
+          </w:p>
+        </w:tc>
+        <w:tc>
+          <w:tcPr>
+            <w:tcW w:type="dxa" w:w="5443"/>
+          </w:tcPr>
+          <w:p>
+            <w:r/>
+            <w:r>
+              <w:rPr>
+                <w:sz w:val="18"/>
+              </w:rPr>
+              <w:t>debe ser EXACTAMENTE el total de la cartola; si no, se rechaza mostrando la diferencia. Una por parque y mes.</w:t>
+            </w:r>
+          </w:p>
+        </w:tc>
+        <w:tc>
+          <w:tcPr>
+            <w:tcW w:type="dxa" w:w="1984"/>
+          </w:tcPr>
+          <w:p>
+            <w:r/>
+            <w:r>
+              <w:rPr>
+                <w:sz w:val="18"/>
+              </w:rPr>
+              <w:t>parques_facturas (UNIQUE parque+mes)</w:t>
+            </w:r>
+          </w:p>
+        </w:tc>
+      </w:tr>
+      <w:tr>
+        <w:tc>
+          <w:tcPr>
+            <w:tcW w:type="dxa" w:w="1928"/>
+          </w:tcPr>
+          <w:p>
+            <w:r/>
+            <w:r>
+              <w:rPr>
+                <w:sz w:val="18"/>
+              </w:rPr>
+              <w:t>ODP mensual</w:t>
+            </w:r>
+          </w:p>
+        </w:tc>
+        <w:tc>
+          <w:tcPr>
+            <w:tcW w:type="dxa" w:w="5443"/>
+          </w:tcPr>
+          <w:p>
+            <w:r/>
+            <w:r>
+              <w:rPr>
+                <w:sz w:val="18"/>
+              </w:rPr>
+              <w:t>una por parque y mes por el total de la factura; solo con FACTURA RECIBIDA en todas las ops.</w:t>
+            </w:r>
+          </w:p>
+        </w:tc>
+        <w:tc>
+          <w:tcPr>
+            <w:tcW w:type="dxa" w:w="1984"/>
+          </w:tcPr>
+          <w:p>
+            <w:r/>
+            <w:r>
+              <w:rPr>
+                <w:sz w:val="18"/>
+              </w:rPr>
+              <w:t>orden-pago-parque</w:t>
+            </w:r>
+          </w:p>
+        </w:tc>
+      </w:tr>
+      <w:tr>
+        <w:tc>
+          <w:tcPr>
+            <w:tcW w:type="dxa" w:w="1928"/>
+          </w:tcPr>
+          <w:p>
+            <w:r/>
+            <w:r>
+              <w:rPr>
+                <w:sz w:val="18"/>
+              </w:rPr>
+              <w:t>Arriendo prorrateado (solo rentabilidad)</w:t>
+            </w:r>
+          </w:p>
+        </w:tc>
+        <w:tc>
+          <w:tcPr>
+            <w:tcW w:type="dxa" w:w="5443"/>
+          </w:tcPr>
+          <w:p>
+            <w:r/>
+            <w:r>
+              <w:rPr>
+                <w:sz w:val="18"/>
+              </w:rPr>
+              <w:t>arriendo_parque de cada op = arriendo fijo ÷ N ops otorgadas del parque en el mes (con 0 ops, el dashboard igual carga el fijo). No se paga por aquí: es medición.</w:t>
+            </w:r>
+          </w:p>
+        </w:tc>
+        <w:tc>
+          <w:tcPr>
+            <w:tcW w:type="dxa" w:w="1984"/>
+          </w:tcPr>
+          <w:p>
+            <w:r/>
+            <w:r>
+              <w:rPr>
+                <w:sz w:val="18"/>
+              </w:rPr>
+              <w:t>recalcular-mes.js</w:t>
+            </w:r>
+          </w:p>
+        </w:tc>
+      </w:tr>
+      <w:tr>
+        <w:tc>
+          <w:tcPr>
+            <w:tcW w:type="dxa" w:w="1928"/>
+          </w:tcPr>
+          <w:p>
+            <w:r/>
+            <w:r>
+              <w:rPr>
+                <w:sz w:val="18"/>
+              </w:rPr>
+              <w:t>Devengo</w:t>
+            </w:r>
+          </w:p>
+        </w:tc>
+        <w:tc>
+          <w:tcPr>
+            <w:tcW w:type="dxa" w:w="5443"/>
+          </w:tcPr>
+          <w:p>
+            <w:r/>
+            <w:r>
+              <w:rPr>
+                <w:sz w:val="18"/>
+              </w:rPr>
+              <w:t>al aprobar: comisión → 4001100, arriendo → 4002100, contra 2106012; idempotente por referencia parque+mes.</w:t>
+            </w:r>
+          </w:p>
+        </w:tc>
+        <w:tc>
+          <w:tcPr>
+            <w:tcW w:type="dxa" w:w="1984"/>
+          </w:tcPr>
+          <w:p>
+            <w:r/>
+            <w:r>
+              <w:rPr>
+                <w:sz w:val="18"/>
+              </w:rPr>
+              <w:t>COMISION_PARQUES</w:t>
+            </w:r>
+          </w:p>
+        </w:tc>
+      </w:tr>
+    </w:tbl>
+    <w:p>
+      <w:pPr>
+        <w:spacing w:after="40"/>
+      </w:pPr>
+    </w:p>
+    <w:p>
+      <w:pPr>
+        <w:spacing w:after="40"/>
+      </w:pPr>
+      <w:r>
+        <w:rPr>
+          <w:b/>
+          <w:i w:val="0"/>
+          <w:color w:val="1F4E79"/>
+        </w:rPr>
+        <w:t>Ejemplo numérico (parque Autocenter Maipú, comisión 1,2%, arriendo $450.000 por Pagos Recurrentes)</w:t>
+      </w:r>
+    </w:p>
+    <w:tbl>
+      <w:tblPr>
+        <w:tblStyle w:val="TableGrid"/>
+        <w:tblW w:type="auto" w:w="0"/>
+        <w:jc w:val="center"/>
+        <w:tblLook w:firstColumn="1" w:firstRow="1" w:lastColumn="0" w:lastRow="0" w:noHBand="0" w:noVBand="1" w:val="04A0"/>
+      </w:tblPr>
+      <w:tblGrid>
+        <w:gridCol w:w="3249"/>
+        <w:gridCol w:w="3249"/>
+        <w:gridCol w:w="3249"/>
+      </w:tblGrid>
+      <w:tr>
+        <w:tc>
+          <w:tcPr>
+            <w:tcW w:type="dxa" w:w="2835"/>
+            <w:shd w:val="clear" w:color="auto" w:fill="1F4E79"/>
+          </w:tcPr>
+          <w:p>
+            <w:r/>
+            <w:r>
+              <w:rPr>
+                <w:b/>
+                <w:color w:val="FFFFFF"/>
+                <w:sz w:val="18"/>
+              </w:rPr>
+              <w:t>Caso</w:t>
+            </w:r>
+          </w:p>
+        </w:tc>
+        <w:tc>
+          <w:tcPr>
+            <w:tcW w:type="dxa" w:w="4535"/>
+            <w:shd w:val="clear" w:color="auto" w:fill="1F4E79"/>
+          </w:tcPr>
+          <w:p>
+            <w:r/>
+            <w:r>
+              <w:rPr>
+                <w:b/>
+                <w:color w:val="FFFFFF"/>
+                <w:sz w:val="18"/>
+              </w:rPr>
+              <w:t>Cálculo</w:t>
+            </w:r>
+          </w:p>
+        </w:tc>
+        <w:tc>
+          <w:tcPr>
+            <w:tcW w:type="dxa" w:w="1984"/>
+            <w:shd w:val="clear" w:color="auto" w:fill="1F4E79"/>
+          </w:tcPr>
+          <w:p>
+            <w:r/>
+            <w:r>
+              <w:rPr>
+                <w:b/>
+                <w:color w:val="FFFFFF"/>
+                <w:sz w:val="18"/>
+              </w:rPr>
+              <w:t>Resultado</w:t>
+            </w:r>
+          </w:p>
+        </w:tc>
+      </w:tr>
+      <w:tr>
+        <w:tc>
+          <w:tcPr>
+            <w:tcW w:type="dxa" w:w="2835"/>
+          </w:tcPr>
+          <w:p>
+            <w:r/>
+            <w:r>
+              <w:rPr>
+                <w:sz w:val="18"/>
+              </w:rPr>
+              <w:t>Op A: saldo 9.000.000, otorgada 05-08, liberada 20-08</w:t>
+            </w:r>
+          </w:p>
+        </w:tc>
+        <w:tc>
+          <w:tcPr>
+            <w:tcW w:type="dxa" w:w="4535"/>
+          </w:tcPr>
+          <w:p>
+            <w:r/>
+            <w:r>
+              <w:rPr>
+                <w:sz w:val="18"/>
+              </w:rPr>
+              <w:t>9.000.000 × 1,2%</w:t>
+            </w:r>
+          </w:p>
+        </w:tc>
+        <w:tc>
+          <w:tcPr>
+            <w:tcW w:type="dxa" w:w="1984"/>
+          </w:tcPr>
+          <w:p>
+            <w:r/>
+            <w:r>
+              <w:rPr>
+                <w:sz w:val="18"/>
+              </w:rPr>
+              <w:t>$108.000 → cartola de agosto</w:t>
+            </w:r>
+          </w:p>
+        </w:tc>
+      </w:tr>
+      <w:tr>
+        <w:tc>
+          <w:tcPr>
+            <w:tcW w:type="dxa" w:w="2835"/>
+          </w:tcPr>
+          <w:p>
+            <w:r/>
+            <w:r>
+              <w:rPr>
+                <w:sz w:val="18"/>
+              </w:rPr>
+              <w:t>Op B: saldo 7.500.000, otorgada 12-08, liberada 03-09</w:t>
+            </w:r>
+          </w:p>
+        </w:tc>
+        <w:tc>
+          <w:tcPr>
+            <w:tcW w:type="dxa" w:w="4535"/>
+          </w:tcPr>
+          <w:p>
+            <w:r/>
+            <w:r>
+              <w:rPr>
+                <w:sz w:val="18"/>
+              </w:rPr>
+              <w:t>liberada después del cierre de agosto</w:t>
+            </w:r>
+          </w:p>
+        </w:tc>
+        <w:tc>
+          <w:tcPr>
+            <w:tcW w:type="dxa" w:w="1984"/>
+          </w:tcPr>
+          <w:p>
+            <w:r/>
+            <w:r>
+              <w:rPr>
+                <w:sz w:val="18"/>
+              </w:rPr>
+              <w:t>$90.000 → cartola de septiembre (arrastre)</w:t>
+            </w:r>
+          </w:p>
+        </w:tc>
+      </w:tr>
+      <w:tr>
+        <w:tc>
+          <w:tcPr>
+            <w:tcW w:type="dxa" w:w="2835"/>
+          </w:tcPr>
+          <w:p>
+            <w:r/>
+            <w:r>
+              <w:rPr>
+                <w:sz w:val="18"/>
+              </w:rPr>
+              <w:t>Op C: saldo 6.000.000, otorgada 28-07, comisión no cobrada en julio, liberada 10-08</w:t>
+            </w:r>
+          </w:p>
+        </w:tc>
+        <w:tc>
+          <w:tcPr>
+            <w:tcW w:type="dxa" w:w="4535"/>
+          </w:tcPr>
+          <w:p>
+            <w:r/>
+            <w:r>
+              <w:rPr>
+                <w:sz w:val="18"/>
+              </w:rPr>
+              <w:t>entra por arrastre</w:t>
+            </w:r>
+          </w:p>
+        </w:tc>
+        <w:tc>
+          <w:tcPr>
+            <w:tcW w:type="dxa" w:w="1984"/>
+          </w:tcPr>
+          <w:p>
+            <w:r/>
+            <w:r>
+              <w:rPr>
+                <w:sz w:val="18"/>
+              </w:rPr>
+              <w:t>$72.000 → cartola de agosto</w:t>
+            </w:r>
+          </w:p>
+        </w:tc>
+      </w:tr>
+      <w:tr>
+        <w:tc>
+          <w:tcPr>
+            <w:tcW w:type="dxa" w:w="2835"/>
+          </w:tcPr>
+          <w:p>
+            <w:r/>
+            <w:r>
+              <w:rPr>
+                <w:sz w:val="18"/>
+              </w:rPr>
+              <w:t>Op D: cursada en CALLE por un dealer que también opera en el parque</w:t>
+            </w:r>
+          </w:p>
+        </w:tc>
+        <w:tc>
+          <w:tcPr>
+            <w:tcW w:type="dxa" w:w="4535"/>
+          </w:tcPr>
+          <w:p>
+            <w:r/>
+            <w:r>
+              <w:rPr>
+                <w:sz w:val="18"/>
+              </w:rPr>
+              <w:t>no es del parque</w:t>
+            </w:r>
+          </w:p>
+        </w:tc>
+        <w:tc>
+          <w:tcPr>
+            <w:tcW w:type="dxa" w:w="1984"/>
+          </w:tcPr>
+          <w:p>
+            <w:r/>
+            <w:r>
+              <w:rPr>
+                <w:sz w:val="18"/>
+              </w:rPr>
+              <w:t>fuera</w:t>
+            </w:r>
+          </w:p>
+        </w:tc>
+      </w:tr>
+      <w:tr>
+        <w:tc>
+          <w:tcPr>
+            <w:tcW w:type="dxa" w:w="2835"/>
+          </w:tcPr>
+          <w:p>
+            <w:r/>
+            <w:r>
+              <w:rPr>
+                <w:sz w:val="18"/>
+              </w:rPr>
+              <w:t>Cartola de agosto</w:t>
+            </w:r>
+          </w:p>
+        </w:tc>
+        <w:tc>
+          <w:tcPr>
+            <w:tcW w:type="dxa" w:w="4535"/>
+          </w:tcPr>
+          <w:p>
+            <w:r/>
+            <w:r>
+              <w:rPr>
+                <w:sz w:val="18"/>
+              </w:rPr>
+              <w:t>108.000 + 72.000 (+ otras 10 ops = 960.000)</w:t>
+            </w:r>
+          </w:p>
+        </w:tc>
+        <w:tc>
+          <w:tcPr>
+            <w:tcW w:type="dxa" w:w="1984"/>
+          </w:tcPr>
+          <w:p>
+            <w:r/>
+            <w:r>
+              <w:rPr>
+                <w:sz w:val="18"/>
+              </w:rPr>
+              <w:t>total $1.140.000, sin arriendo</w:t>
+            </w:r>
+          </w:p>
+        </w:tc>
+      </w:tr>
+      <w:tr>
+        <w:tc>
+          <w:tcPr>
+            <w:tcW w:type="dxa" w:w="2835"/>
+          </w:tcPr>
+          <w:p>
+            <w:r/>
+            <w:r>
+              <w:rPr>
+                <w:sz w:val="18"/>
+              </w:rPr>
+              <w:t>Arriendo de agosto</w:t>
+            </w:r>
+          </w:p>
+        </w:tc>
+        <w:tc>
+          <w:tcPr>
+            <w:tcW w:type="dxa" w:w="4535"/>
+          </w:tcPr>
+          <w:p>
+            <w:r/>
+            <w:r>
+              <w:rPr>
+                <w:sz w:val="18"/>
+              </w:rPr>
+              <w:t>Pagos Recurrentes emite la ODP el 06-09 por 450.000 (tipo Arriendos, proveedor = parque)</w:t>
+            </w:r>
+          </w:p>
+        </w:tc>
+        <w:tc>
+          <w:tcPr>
+            <w:tcW w:type="dxa" w:w="1984"/>
+          </w:tcPr>
+          <w:p>
+            <w:r/>
+            <w:r>
+              <w:rPr>
+                <w:sz w:val="18"/>
+              </w:rPr>
+              <w:t>ODP aparte</w:t>
+            </w:r>
+          </w:p>
+        </w:tc>
+      </w:tr>
+      <w:tr>
+        <w:tc>
+          <w:tcPr>
+            <w:tcW w:type="dxa" w:w="2835"/>
+          </w:tcPr>
+          <w:p>
+            <w:r/>
+            <w:r>
+              <w:rPr>
+                <w:sz w:val="18"/>
+              </w:rPr>
+              <w:t>Rentabilidad (medición, no pago)</w:t>
+            </w:r>
+          </w:p>
+        </w:tc>
+        <w:tc>
+          <w:tcPr>
+            <w:tcW w:type="dxa" w:w="4535"/>
+          </w:tcPr>
+          <w:p>
+            <w:r/>
+            <w:r>
+              <w:rPr>
+                <w:sz w:val="18"/>
+              </w:rPr>
+              <w:t>arriendo prorrateado = 450.000 ÷ 12 ops otorgadas en agosto</w:t>
+            </w:r>
+          </w:p>
+        </w:tc>
+        <w:tc>
+          <w:tcPr>
+            <w:tcW w:type="dxa" w:w="1984"/>
+          </w:tcPr>
+          <w:p>
+            <w:r/>
+            <w:r>
+              <w:rPr>
+                <w:sz w:val="18"/>
+              </w:rPr>
+              <w:t>$37.500 por op</w:t>
+            </w:r>
+          </w:p>
+        </w:tc>
+      </w:tr>
+      <w:tr>
+        <w:tc>
+          <w:tcPr>
+            <w:tcW w:type="dxa" w:w="2835"/>
+          </w:tcPr>
+          <w:p>
+            <w:r/>
+            <w:r>
+              <w:rPr>
+                <w:sz w:val="18"/>
+              </w:rPr>
+              <w:t>Factura por 1.150.000</w:t>
+            </w:r>
+          </w:p>
+        </w:tc>
+        <w:tc>
+          <w:tcPr>
+            <w:tcW w:type="dxa" w:w="4535"/>
+          </w:tcPr>
+          <w:p>
+            <w:r/>
+            <w:r>
+              <w:rPr>
+                <w:sz w:val="18"/>
+              </w:rPr>
+              <w:t>diferencia +10.000 → rechazada</w:t>
+            </w:r>
+          </w:p>
+        </w:tc>
+        <w:tc>
+          <w:tcPr>
+            <w:tcW w:type="dxa" w:w="1984"/>
+          </w:tcPr>
+          <w:p>
+            <w:r/>
+            <w:r>
+              <w:rPr>
+                <w:sz w:val="18"/>
+              </w:rPr>
+              <w:t>el parque corrige la factura</w:t>
+            </w:r>
+          </w:p>
+        </w:tc>
+      </w:tr>
+      <w:tr>
+        <w:tc>
+          <w:tcPr>
+            <w:tcW w:type="dxa" w:w="2835"/>
+          </w:tcPr>
+          <w:p>
+            <w:r/>
+            <w:r>
+              <w:rPr>
+                <w:sz w:val="18"/>
+              </w:rPr>
+              <w:t>Factura por 1.140.000 → ODP → pago</w:t>
+            </w:r>
+          </w:p>
+        </w:tc>
+        <w:tc>
+          <w:tcPr>
+            <w:tcW w:type="dxa" w:w="4535"/>
+          </w:tcPr>
+          <w:p>
+            <w:r/>
+            <w:r>
+              <w:rPr>
+                <w:sz w:val="18"/>
+              </w:rPr>
+              <w:t>DEBE 2106012 1.140.000 / HABER Banco 1.140.000</w:t>
+            </w:r>
+          </w:p>
+        </w:tc>
+        <w:tc>
+          <w:tcPr>
+            <w:tcW w:type="dxa" w:w="1984"/>
+          </w:tcPr>
+          <w:p>
+            <w:r/>
+            <w:r>
+              <w:rPr>
+                <w:sz w:val="18"/>
+              </w:rPr>
+              <w:t>COMISIÓN PAGADA × 12 ops</w:t>
+            </w:r>
+          </w:p>
+        </w:tc>
+      </w:tr>
+    </w:tbl>
+    <w:p>
+      <w:pPr>
+        <w:spacing w:after="40"/>
+      </w:pPr>
+    </w:p>
+    <w:tbl>
+      <w:tblPr>
+        <w:tblStyle w:val="TableGrid"/>
+        <w:tblW w:type="auto" w:w="0"/>
+        <w:tblLook w:firstColumn="1" w:firstRow="1" w:lastColumn="0" w:lastRow="0" w:noHBand="0" w:noVBand="1" w:val="04A0"/>
+      </w:tblPr>
+      <w:tblGrid>
+        <w:gridCol w:w="9746"/>
+      </w:tblGrid>
+      <w:tr>
+        <w:tc>
+          <w:tcPr>
+            <w:tcW w:type="dxa" w:w="9746"/>
+            <w:shd w:val="clear" w:color="auto" w:fill="E8F0F8"/>
+          </w:tcPr>
+          <w:p>
+            <w:r/>
+            <w:r>
+              <w:rPr>
+                <w:b/>
+                <w:sz w:val="19"/>
+              </w:rPr>
+              <w:t>🔒 Cómo cuadrar a mano</w:t>
+              <w:br/>
+            </w:r>
+            <w:r>
+              <w:rPr>
+                <w:sz w:val="19"/>
+              </w:rPr>
+              <w:t>Total de la cartola = Σ (saldo precio × % del parque) de las ops del parque otorgadas hasta el mes y liberadas a pago al cierre, que no hayan salido en una cartola anterior; la foto de la cartola lista cada una. La factura tiene que ser exacta, sin tolerancia. Si el parque reclama una op que no aparece, casi siempre está sin LIBERADO A PAGO: arrastra al mes siguiente.</w:t>
             </w:r>
           </w:p>
         </w:tc>

</xml_diff>

<commit_message>
docs: Manual de Órdenes de Pago y Pagos Recurrentes (Biblioteca Word) — libro central, emisión, historial, proveedores, Otras Compras a Pagar, pagos recurrentes, compras de oficina, caja y contabilidad con fórmulas y ejemplos; Manual de Pagos v1.2 corrige el ejemplo de boleta (bruto = comisión ÷ 1,19); documentación v4.4, manual v8.92 (v257.8)
Co-Authored-By: Claude Fable 5.1 <noreply@anthropic.com>
</commit_message>
<xml_diff>
--- a/api-gateway/public/mantenedores/documentacion/descargas/Manual-Pagos-Saldos-Comisiones-Business-Suite.docx
+++ b/api-gateway/public/mantenedores/documentacion/descargas/Manual-Pagos-Saldos-Comisiones-Business-Suite.docx
@@ -236,7 +236,7 @@
           <w:i w:val="0"/>
           <w:sz w:val="22"/>
         </w:rPr>
-        <w:t>Versión 1.1 · 18 de septiembre de 2026 · Suite v257.6</w:t>
+        <w:t>Versión 1.2 · 18 de septiembre de 2026 · Suite v257.8</w:t>
       </w:r>
     </w:p>
     <w:p>
@@ -462,6 +462,64 @@
                 <w:sz w:val="18"/>
               </w:rPr>
               <w:t>Secciones de fórmulas y criterios con ejemplo numérico y caja "Cómo cuadrar a mano" para saldos (8.1), comisión dealer (14.1) y comisión parque (19.1).</w:t>
+            </w:r>
+          </w:p>
+        </w:tc>
+      </w:tr>
+      <w:tr>
+        <w:tc>
+          <w:tcPr>
+            <w:tcW w:type="dxa" w:w="907"/>
+          </w:tcPr>
+          <w:p>
+            <w:r/>
+            <w:r>
+              <w:rPr>
+                <w:sz w:val="18"/>
+              </w:rPr>
+              <w:t>1.2</w:t>
+            </w:r>
+          </w:p>
+        </w:tc>
+        <w:tc>
+          <w:tcPr>
+            <w:tcW w:type="dxa" w:w="1247"/>
+          </w:tcPr>
+          <w:p>
+            <w:r/>
+            <w:r>
+              <w:rPr>
+                <w:sz w:val="18"/>
+              </w:rPr>
+              <w:t>18-09-2026</w:t>
+            </w:r>
+          </w:p>
+        </w:tc>
+        <w:tc>
+          <w:tcPr>
+            <w:tcW w:type="dxa" w:w="2041"/>
+          </w:tcPr>
+          <w:p>
+            <w:r/>
+            <w:r>
+              <w:rPr>
+                <w:sz w:val="18"/>
+              </w:rPr>
+              <w:t>Patricio Escobar / Claude</w:t>
+            </w:r>
+          </w:p>
+        </w:tc>
+        <w:tc>
+          <w:tcPr>
+            <w:tcW w:type="dxa" w:w="5159"/>
+          </w:tcPr>
+          <w:p>
+            <w:r/>
+            <w:r>
+              <w:rPr>
+                <w:sz w:val="18"/>
+              </w:rPr>
+              <w:t>Corrección: el bruto de la boleta de honorarios es el neto de la factura equivalente (comisión ÷ 1,19); ejemplo recalculado.</w:t>
             </w:r>
           </w:p>
         </w:tc>
@@ -7803,7 +7861,7 @@
               <w:rPr>
                 <w:sz w:val="18"/>
               </w:rPr>
-              <w:t>honorario bruto 1.190.000; retención 15,25% (mantenedor Impuestos) = 181.475; líquido 1.008.525</w:t>
+              <w:t>la boleta es por el NETO de la factura equivalente: 1.190.000 ÷ 1,19 = 1.000.000 (bruto de la boleta); retención 15,25% (mantenedor Impuestos) = 152.500; líquido 847.500. Si el emisor retiene: paga 1.000.000</w:t>
             </w:r>
           </w:p>
         </w:tc>
@@ -7817,7 +7875,7 @@
               <w:rPr>
                 <w:sz w:val="18"/>
               </w:rPr>
-              <w:t>la ODP paga $1.008.525; la retención va al F29</w:t>
+              <w:t>la ODP paga $847.500; la retención va al F29</w:t>
             </w:r>
           </w:p>
         </w:tc>
@@ -8334,7 +8392,7 @@
               <w:rPr>
                 <w:sz w:val="18"/>
               </w:rPr>
-              <w:t>base = bruto · retención = bruto × % · a pagar = bruto − retención (la retención es pasivo con el SII, va al F29).</w:t>
+              <w:t>bruto de la boleta = comisión bruta ÷ 1,19 (el neto de la factura equivalente) · retención = bruto boleta × % · a pagar = bruto boleta − retención (la retención es pasivo con el SII, va al F29). Con "emisor retiene": retención 0, se paga el bruto de la boleta.</w:t>
             </w:r>
           </w:p>
         </w:tc>
@@ -8932,7 +8990,7 @@
               <w:rPr>
                 <w:sz w:val="18"/>
               </w:rPr>
-              <w:t>Boleta de honorarios por 1.190.000</w:t>
+              <w:t>Boleta de honorarios (comisión bruta 1.190.000)</w:t>
             </w:r>
           </w:p>
         </w:tc>
@@ -8946,7 +9004,7 @@
               <w:rPr>
                 <w:sz w:val="18"/>
               </w:rPr>
-              <w:t>retención 1.190.000 × 15,25% = 181.475 · a pagar 1.008.525</w:t>
+              <w:t>bruto boleta 1.000.000 · retención 152.500 · a pagar 847.500 (emisor retiene: 1.000.000)</w:t>
             </w:r>
           </w:p>
         </w:tc>
@@ -8960,7 +9018,7 @@
               <w:rPr>
                 <w:sz w:val="18"/>
               </w:rPr>
-              <w:t>ODP $1.008.525</w:t>
+              <w:t>ODP $847.500</w:t>
             </w:r>
           </w:p>
         </w:tc>

</xml_diff>